<commit_message>
feat(eval): add MAP/MRR/Hit@K rank metrics to Word report
</commit_message>
<xml_diff>
--- a/tests/evaluation/results/bao-cao-ket-qua-eval.docx
+++ b/tests/evaluation/results/bao-cao-ket-qua-eval.docx
@@ -1143,6 +1143,725 @@
             </w:pPr>
             <w:r>
               <w:t>Cần cải thiện</w:t>
+            </w:r>
+          </w:p>
+        </w:tc>
+      </w:tr>
+    </w:tbl>
+    <w:p/>
+    <w:p>
+      <w:r>
+        <w:rPr>
+          <w:b/>
+        </w:rPr>
+        <w:t>Retrieval Rank Metrics (Auepora):</w:t>
+      </w:r>
+    </w:p>
+    <w:tbl>
+      <w:tblPr>
+        <w:tblStyle w:val="TableGrid"/>
+        <w:tblW w:type="auto" w:w="0"/>
+        <w:tblLook w:firstColumn="1" w:firstRow="1" w:lastColumn="0" w:lastRow="0" w:noHBand="0" w:noVBand="1" w:val="04A0"/>
+      </w:tblPr>
+      <w:tblGrid>
+        <w:gridCol w:w="3135"/>
+        <w:gridCol w:w="3135"/>
+        <w:gridCol w:w="3135"/>
+      </w:tblGrid>
+      <w:tr>
+        <w:tc>
+          <w:tcPr>
+            <w:tcW w:type="dxa" w:w="3135"/>
+            <w:shd w:val="clear" w:color="auto" w:fill="375623"/>
+          </w:tcPr>
+          <w:p>
+            <w:r>
+              <w:rPr>
+                <w:b/>
+                <w:color w:val="FFFFFF"/>
+              </w:rPr>
+              <w:t>Metric</w:t>
+            </w:r>
+          </w:p>
+        </w:tc>
+        <w:tc>
+          <w:tcPr>
+            <w:tcW w:type="dxa" w:w="3135"/>
+            <w:shd w:val="clear" w:color="auto" w:fill="375623"/>
+          </w:tcPr>
+          <w:p>
+            <w:r>
+              <w:rPr>
+                <w:b/>
+                <w:color w:val="FFFFFF"/>
+              </w:rPr>
+              <w:t>Điểm</w:t>
+            </w:r>
+          </w:p>
+        </w:tc>
+        <w:tc>
+          <w:tcPr>
+            <w:tcW w:type="dxa" w:w="3135"/>
+            <w:shd w:val="clear" w:color="auto" w:fill="375623"/>
+          </w:tcPr>
+          <w:p>
+            <w:r>
+              <w:rPr>
+                <w:b/>
+                <w:color w:val="FFFFFF"/>
+              </w:rPr>
+              <w:t>Đánh giá</w:t>
+            </w:r>
+          </w:p>
+        </w:tc>
+      </w:tr>
+      <w:tr>
+        <w:tc>
+          <w:tcPr>
+            <w:tcW w:type="dxa" w:w="3135"/>
+            <w:shd w:val="clear" w:color="auto" w:fill="FFC7CE"/>
+            <w:tcBorders>
+              <w:top w:val="single" w:sz="4" w:color="CCCCCC"/>
+              <w:left w:val="single" w:sz="4" w:color="CCCCCC"/>
+              <w:bottom w:val="single" w:sz="4" w:color="CCCCCC"/>
+              <w:right w:val="single" w:sz="4" w:color="CCCCCC"/>
+            </w:tcBorders>
+          </w:tcPr>
+          <w:p>
+            <w:r>
+              <w:t>MAP@10</w:t>
+            </w:r>
+          </w:p>
+        </w:tc>
+        <w:tc>
+          <w:tcPr>
+            <w:tcW w:type="dxa" w:w="3135"/>
+            <w:shd w:val="clear" w:color="auto" w:fill="FFC7CE"/>
+            <w:tcBorders>
+              <w:top w:val="single" w:sz="4" w:color="CCCCCC"/>
+              <w:left w:val="single" w:sz="4" w:color="CCCCCC"/>
+              <w:bottom w:val="single" w:sz="4" w:color="CCCCCC"/>
+              <w:right w:val="single" w:sz="4" w:color="CCCCCC"/>
+            </w:tcBorders>
+          </w:tcPr>
+          <w:p>
+            <w:pPr>
+              <w:jc w:val="center"/>
+            </w:pPr>
+            <w:r>
+              <w:t>0.6959</w:t>
+            </w:r>
+          </w:p>
+        </w:tc>
+        <w:tc>
+          <w:tcPr>
+            <w:tcW w:type="dxa" w:w="3135"/>
+            <w:shd w:val="clear" w:color="auto" w:fill="FFC7CE"/>
+            <w:tcBorders>
+              <w:top w:val="single" w:sz="4" w:color="CCCCCC"/>
+              <w:left w:val="single" w:sz="4" w:color="CCCCCC"/>
+              <w:bottom w:val="single" w:sz="4" w:color="CCCCCC"/>
+              <w:right w:val="single" w:sz="4" w:color="CCCCCC"/>
+            </w:tcBorders>
+          </w:tcPr>
+          <w:p>
+            <w:pPr>
+              <w:jc w:val="center"/>
+            </w:pPr>
+            <w:r>
+              <w:t>Khá</w:t>
+            </w:r>
+          </w:p>
+        </w:tc>
+      </w:tr>
+      <w:tr>
+        <w:tc>
+          <w:tcPr>
+            <w:tcW w:type="dxa" w:w="3135"/>
+            <w:shd w:val="clear" w:color="auto" w:fill="FFEB9C"/>
+            <w:tcBorders>
+              <w:top w:val="single" w:sz="4" w:color="CCCCCC"/>
+              <w:left w:val="single" w:sz="4" w:color="CCCCCC"/>
+              <w:bottom w:val="single" w:sz="4" w:color="CCCCCC"/>
+              <w:right w:val="single" w:sz="4" w:color="CCCCCC"/>
+            </w:tcBorders>
+          </w:tcPr>
+          <w:p>
+            <w:r>
+              <w:t>MRR</w:t>
+            </w:r>
+          </w:p>
+        </w:tc>
+        <w:tc>
+          <w:tcPr>
+            <w:tcW w:type="dxa" w:w="3135"/>
+            <w:shd w:val="clear" w:color="auto" w:fill="FFEB9C"/>
+            <w:tcBorders>
+              <w:top w:val="single" w:sz="4" w:color="CCCCCC"/>
+              <w:left w:val="single" w:sz="4" w:color="CCCCCC"/>
+              <w:bottom w:val="single" w:sz="4" w:color="CCCCCC"/>
+              <w:right w:val="single" w:sz="4" w:color="CCCCCC"/>
+            </w:tcBorders>
+          </w:tcPr>
+          <w:p>
+            <w:pPr>
+              <w:jc w:val="center"/>
+            </w:pPr>
+            <w:r>
+              <w:t>0.7287</w:t>
+            </w:r>
+          </w:p>
+        </w:tc>
+        <w:tc>
+          <w:tcPr>
+            <w:tcW w:type="dxa" w:w="3135"/>
+            <w:shd w:val="clear" w:color="auto" w:fill="FFEB9C"/>
+            <w:tcBorders>
+              <w:top w:val="single" w:sz="4" w:color="CCCCCC"/>
+              <w:left w:val="single" w:sz="4" w:color="CCCCCC"/>
+              <w:bottom w:val="single" w:sz="4" w:color="CCCCCC"/>
+              <w:right w:val="single" w:sz="4" w:color="CCCCCC"/>
+            </w:tcBorders>
+          </w:tcPr>
+          <w:p>
+            <w:pPr>
+              <w:jc w:val="center"/>
+            </w:pPr>
+            <w:r>
+              <w:t>Khá</w:t>
+            </w:r>
+          </w:p>
+        </w:tc>
+      </w:tr>
+      <w:tr>
+        <w:tc>
+          <w:tcPr>
+            <w:tcW w:type="dxa" w:w="3135"/>
+            <w:shd w:val="clear" w:color="auto" w:fill="FFEB9C"/>
+            <w:tcBorders>
+              <w:top w:val="single" w:sz="4" w:color="CCCCCC"/>
+              <w:left w:val="single" w:sz="4" w:color="CCCCCC"/>
+              <w:bottom w:val="single" w:sz="4" w:color="CCCCCC"/>
+              <w:right w:val="single" w:sz="4" w:color="CCCCCC"/>
+            </w:tcBorders>
+          </w:tcPr>
+          <w:p>
+            <w:r>
+              <w:t>Hit@10</w:t>
+            </w:r>
+          </w:p>
+        </w:tc>
+        <w:tc>
+          <w:tcPr>
+            <w:tcW w:type="dxa" w:w="3135"/>
+            <w:shd w:val="clear" w:color="auto" w:fill="FFEB9C"/>
+            <w:tcBorders>
+              <w:top w:val="single" w:sz="4" w:color="CCCCCC"/>
+              <w:left w:val="single" w:sz="4" w:color="CCCCCC"/>
+              <w:bottom w:val="single" w:sz="4" w:color="CCCCCC"/>
+              <w:right w:val="single" w:sz="4" w:color="CCCCCC"/>
+            </w:tcBorders>
+          </w:tcPr>
+          <w:p>
+            <w:pPr>
+              <w:jc w:val="center"/>
+            </w:pPr>
+            <w:r>
+              <w:t>0.8000</w:t>
+            </w:r>
+          </w:p>
+        </w:tc>
+        <w:tc>
+          <w:tcPr>
+            <w:tcW w:type="dxa" w:w="3135"/>
+            <w:shd w:val="clear" w:color="auto" w:fill="FFEB9C"/>
+            <w:tcBorders>
+              <w:top w:val="single" w:sz="4" w:color="CCCCCC"/>
+              <w:left w:val="single" w:sz="4" w:color="CCCCCC"/>
+              <w:bottom w:val="single" w:sz="4" w:color="CCCCCC"/>
+              <w:right w:val="single" w:sz="4" w:color="CCCCCC"/>
+            </w:tcBorders>
+          </w:tcPr>
+          <w:p>
+            <w:pPr>
+              <w:jc w:val="center"/>
+            </w:pPr>
+            <w:r>
+              <w:t>Tốt</w:t>
+            </w:r>
+          </w:p>
+        </w:tc>
+      </w:tr>
+    </w:tbl>
+    <w:p/>
+    <w:p>
+      <w:r>
+        <w:rPr>
+          <w:b/>
+        </w:rPr>
+        <w:t>Retrieval Rank Metrics theo danh mục (k=10):</w:t>
+      </w:r>
+    </w:p>
+    <w:tbl>
+      <w:tblPr>
+        <w:tblStyle w:val="TableGrid"/>
+        <w:tblW w:type="auto" w:w="0"/>
+        <w:tblLook w:firstColumn="1" w:firstRow="1" w:lastColumn="0" w:lastRow="0" w:noHBand="0" w:noVBand="1" w:val="04A0"/>
+      </w:tblPr>
+      <w:tblGrid>
+        <w:gridCol w:w="2351"/>
+        <w:gridCol w:w="2351"/>
+        <w:gridCol w:w="2351"/>
+        <w:gridCol w:w="2351"/>
+      </w:tblGrid>
+      <w:tr>
+        <w:tc>
+          <w:tcPr>
+            <w:tcW w:type="dxa" w:w="2351"/>
+            <w:shd w:val="clear" w:color="auto" w:fill="375623"/>
+          </w:tcPr>
+          <w:p>
+            <w:r>
+              <w:rPr>
+                <w:b/>
+                <w:color w:val="FFFFFF"/>
+              </w:rPr>
+              <w:t>Danh mục</w:t>
+            </w:r>
+          </w:p>
+        </w:tc>
+        <w:tc>
+          <w:tcPr>
+            <w:tcW w:type="dxa" w:w="2351"/>
+            <w:shd w:val="clear" w:color="auto" w:fill="375623"/>
+          </w:tcPr>
+          <w:p>
+            <w:r>
+              <w:rPr>
+                <w:b/>
+                <w:color w:val="FFFFFF"/>
+              </w:rPr>
+              <w:t>MAP@10</w:t>
+            </w:r>
+          </w:p>
+        </w:tc>
+        <w:tc>
+          <w:tcPr>
+            <w:tcW w:type="dxa" w:w="2351"/>
+            <w:shd w:val="clear" w:color="auto" w:fill="375623"/>
+          </w:tcPr>
+          <w:p>
+            <w:r>
+              <w:rPr>
+                <w:b/>
+                <w:color w:val="FFFFFF"/>
+              </w:rPr>
+              <w:t>MRR</w:t>
+            </w:r>
+          </w:p>
+        </w:tc>
+        <w:tc>
+          <w:tcPr>
+            <w:tcW w:type="dxa" w:w="2351"/>
+            <w:shd w:val="clear" w:color="auto" w:fill="375623"/>
+          </w:tcPr>
+          <w:p>
+            <w:r>
+              <w:rPr>
+                <w:b/>
+                <w:color w:val="FFFFFF"/>
+              </w:rPr>
+              <w:t>Hit@10</w:t>
+            </w:r>
+          </w:p>
+        </w:tc>
+      </w:tr>
+      <w:tr>
+        <w:tc>
+          <w:tcPr>
+            <w:tcW w:type="dxa" w:w="2351"/>
+            <w:tcBorders>
+              <w:top w:val="single" w:sz="4" w:color="CCCCCC"/>
+              <w:left w:val="single" w:sz="4" w:color="CCCCCC"/>
+              <w:bottom w:val="single" w:sz="4" w:color="CCCCCC"/>
+              <w:right w:val="single" w:sz="4" w:color="CCCCCC"/>
+            </w:tcBorders>
+          </w:tcPr>
+          <w:p>
+            <w:r>
+              <w:t>Chương trình đào tạo (CTĐT)</w:t>
+            </w:r>
+          </w:p>
+        </w:tc>
+        <w:tc>
+          <w:tcPr>
+            <w:tcW w:type="dxa" w:w="2351"/>
+            <w:shd w:val="clear" w:color="auto" w:fill="FFC7CE"/>
+            <w:tcBorders>
+              <w:top w:val="single" w:sz="4" w:color="CCCCCC"/>
+              <w:left w:val="single" w:sz="4" w:color="CCCCCC"/>
+              <w:bottom w:val="single" w:sz="4" w:color="CCCCCC"/>
+              <w:right w:val="single" w:sz="4" w:color="CCCCCC"/>
+            </w:tcBorders>
+          </w:tcPr>
+          <w:p>
+            <w:pPr>
+              <w:jc w:val="center"/>
+            </w:pPr>
+            <w:r>
+              <w:t>0.2833</w:t>
+            </w:r>
+          </w:p>
+        </w:tc>
+        <w:tc>
+          <w:tcPr>
+            <w:tcW w:type="dxa" w:w="2351"/>
+            <w:shd w:val="clear" w:color="auto" w:fill="FFC7CE"/>
+            <w:tcBorders>
+              <w:top w:val="single" w:sz="4" w:color="CCCCCC"/>
+              <w:left w:val="single" w:sz="4" w:color="CCCCCC"/>
+              <w:bottom w:val="single" w:sz="4" w:color="CCCCCC"/>
+              <w:right w:val="single" w:sz="4" w:color="CCCCCC"/>
+            </w:tcBorders>
+          </w:tcPr>
+          <w:p>
+            <w:pPr>
+              <w:jc w:val="center"/>
+            </w:pPr>
+            <w:r>
+              <w:t>0.2833</w:t>
+            </w:r>
+          </w:p>
+        </w:tc>
+        <w:tc>
+          <w:tcPr>
+            <w:tcW w:type="dxa" w:w="2351"/>
+            <w:shd w:val="clear" w:color="auto" w:fill="FFC7CE"/>
+            <w:tcBorders>
+              <w:top w:val="single" w:sz="4" w:color="CCCCCC"/>
+              <w:left w:val="single" w:sz="4" w:color="CCCCCC"/>
+              <w:bottom w:val="single" w:sz="4" w:color="CCCCCC"/>
+              <w:right w:val="single" w:sz="4" w:color="CCCCCC"/>
+            </w:tcBorders>
+          </w:tcPr>
+          <w:p>
+            <w:pPr>
+              <w:jc w:val="center"/>
+            </w:pPr>
+            <w:r>
+              <w:t>0.5000</w:t>
+            </w:r>
+          </w:p>
+        </w:tc>
+      </w:tr>
+      <w:tr>
+        <w:tc>
+          <w:tcPr>
+            <w:tcW w:type="dxa" w:w="2351"/>
+            <w:tcBorders>
+              <w:top w:val="single" w:sz="4" w:color="CCCCCC"/>
+              <w:left w:val="single" w:sz="4" w:color="CCCCCC"/>
+              <w:bottom w:val="single" w:sz="4" w:color="CCCCCC"/>
+              <w:right w:val="single" w:sz="4" w:color="CCCCCC"/>
+            </w:tcBorders>
+          </w:tcPr>
+          <w:p>
+            <w:r>
+              <w:t>Học phí</w:t>
+            </w:r>
+          </w:p>
+        </w:tc>
+        <w:tc>
+          <w:tcPr>
+            <w:tcW w:type="dxa" w:w="2351"/>
+            <w:shd w:val="clear" w:color="auto" w:fill="FFEB9C"/>
+            <w:tcBorders>
+              <w:top w:val="single" w:sz="4" w:color="CCCCCC"/>
+              <w:left w:val="single" w:sz="4" w:color="CCCCCC"/>
+              <w:bottom w:val="single" w:sz="4" w:color="CCCCCC"/>
+              <w:right w:val="single" w:sz="4" w:color="CCCCCC"/>
+            </w:tcBorders>
+          </w:tcPr>
+          <w:p>
+            <w:pPr>
+              <w:jc w:val="center"/>
+            </w:pPr>
+            <w:r>
+              <w:t>0.7333</w:t>
+            </w:r>
+          </w:p>
+        </w:tc>
+        <w:tc>
+          <w:tcPr>
+            <w:tcW w:type="dxa" w:w="2351"/>
+            <w:shd w:val="clear" w:color="auto" w:fill="FFEB9C"/>
+            <w:tcBorders>
+              <w:top w:val="single" w:sz="4" w:color="CCCCCC"/>
+              <w:left w:val="single" w:sz="4" w:color="CCCCCC"/>
+              <w:bottom w:val="single" w:sz="4" w:color="CCCCCC"/>
+              <w:right w:val="single" w:sz="4" w:color="CCCCCC"/>
+            </w:tcBorders>
+          </w:tcPr>
+          <w:p>
+            <w:pPr>
+              <w:jc w:val="center"/>
+            </w:pPr>
+            <w:r>
+              <w:t>0.8000</w:t>
+            </w:r>
+          </w:p>
+        </w:tc>
+        <w:tc>
+          <w:tcPr>
+            <w:tcW w:type="dxa" w:w="2351"/>
+            <w:shd w:val="clear" w:color="auto" w:fill="FFEB9C"/>
+            <w:tcBorders>
+              <w:top w:val="single" w:sz="4" w:color="CCCCCC"/>
+              <w:left w:val="single" w:sz="4" w:color="CCCCCC"/>
+              <w:bottom w:val="single" w:sz="4" w:color="CCCCCC"/>
+              <w:right w:val="single" w:sz="4" w:color="CCCCCC"/>
+            </w:tcBorders>
+          </w:tcPr>
+          <w:p>
+            <w:pPr>
+              <w:jc w:val="center"/>
+            </w:pPr>
+            <w:r>
+              <w:t>0.8000</w:t>
+            </w:r>
+          </w:p>
+        </w:tc>
+      </w:tr>
+      <w:tr>
+        <w:tc>
+          <w:tcPr>
+            <w:tcW w:type="dxa" w:w="2351"/>
+            <w:tcBorders>
+              <w:top w:val="single" w:sz="4" w:color="CCCCCC"/>
+              <w:left w:val="single" w:sz="4" w:color="CCCCCC"/>
+              <w:bottom w:val="single" w:sz="4" w:color="CCCCCC"/>
+              <w:right w:val="single" w:sz="4" w:color="CCCCCC"/>
+            </w:tcBorders>
+          </w:tcPr>
+          <w:p>
+            <w:r>
+              <w:t>Học vụ</w:t>
+            </w:r>
+          </w:p>
+        </w:tc>
+        <w:tc>
+          <w:tcPr>
+            <w:tcW w:type="dxa" w:w="2351"/>
+            <w:shd w:val="clear" w:color="auto" w:fill="FFEB9C"/>
+            <w:tcBorders>
+              <w:top w:val="single" w:sz="4" w:color="CCCCCC"/>
+              <w:left w:val="single" w:sz="4" w:color="CCCCCC"/>
+              <w:bottom w:val="single" w:sz="4" w:color="CCCCCC"/>
+              <w:right w:val="single" w:sz="4" w:color="CCCCCC"/>
+            </w:tcBorders>
+          </w:tcPr>
+          <w:p>
+            <w:pPr>
+              <w:jc w:val="center"/>
+            </w:pPr>
+            <w:r>
+              <w:t>0.7992</w:t>
+            </w:r>
+          </w:p>
+        </w:tc>
+        <w:tc>
+          <w:tcPr>
+            <w:tcW w:type="dxa" w:w="2351"/>
+            <w:shd w:val="clear" w:color="auto" w:fill="C6EFCE"/>
+            <w:tcBorders>
+              <w:top w:val="single" w:sz="4" w:color="CCCCCC"/>
+              <w:left w:val="single" w:sz="4" w:color="CCCCCC"/>
+              <w:bottom w:val="single" w:sz="4" w:color="CCCCCC"/>
+              <w:right w:val="single" w:sz="4" w:color="CCCCCC"/>
+            </w:tcBorders>
+          </w:tcPr>
+          <w:p>
+            <w:pPr>
+              <w:jc w:val="center"/>
+            </w:pPr>
+            <w:r>
+              <w:t>0.8651</w:t>
+            </w:r>
+          </w:p>
+        </w:tc>
+        <w:tc>
+          <w:tcPr>
+            <w:tcW w:type="dxa" w:w="2351"/>
+            <w:shd w:val="clear" w:color="auto" w:fill="C6EFCE"/>
+            <w:tcBorders>
+              <w:top w:val="single" w:sz="4" w:color="CCCCCC"/>
+              <w:left w:val="single" w:sz="4" w:color="CCCCCC"/>
+              <w:bottom w:val="single" w:sz="4" w:color="CCCCCC"/>
+              <w:right w:val="single" w:sz="4" w:color="CCCCCC"/>
+            </w:tcBorders>
+          </w:tcPr>
+          <w:p>
+            <w:pPr>
+              <w:jc w:val="center"/>
+            </w:pPr>
+            <w:r>
+              <w:t>0.9286</w:t>
+            </w:r>
+          </w:p>
+        </w:tc>
+      </w:tr>
+      <w:tr>
+        <w:tc>
+          <w:tcPr>
+            <w:tcW w:type="dxa" w:w="2351"/>
+            <w:tcBorders>
+              <w:top w:val="single" w:sz="4" w:color="CCCCCC"/>
+              <w:left w:val="single" w:sz="4" w:color="CCCCCC"/>
+              <w:bottom w:val="single" w:sz="4" w:color="CCCCCC"/>
+              <w:right w:val="single" w:sz="4" w:color="CCCCCC"/>
+            </w:tcBorders>
+          </w:tcPr>
+          <w:p>
+            <w:r>
+              <w:t>Quy chế</w:t>
+            </w:r>
+          </w:p>
+        </w:tc>
+        <w:tc>
+          <w:tcPr>
+            <w:tcW w:type="dxa" w:w="2351"/>
+            <w:shd w:val="clear" w:color="auto" w:fill="FFC7CE"/>
+            <w:tcBorders>
+              <w:top w:val="single" w:sz="4" w:color="CCCCCC"/>
+              <w:left w:val="single" w:sz="4" w:color="CCCCCC"/>
+              <w:bottom w:val="single" w:sz="4" w:color="CCCCCC"/>
+              <w:right w:val="single" w:sz="4" w:color="CCCCCC"/>
+            </w:tcBorders>
+          </w:tcPr>
+          <w:p>
+            <w:pPr>
+              <w:jc w:val="center"/>
+            </w:pPr>
+            <w:r>
+              <w:t>0.5625</w:t>
+            </w:r>
+          </w:p>
+        </w:tc>
+        <w:tc>
+          <w:tcPr>
+            <w:tcW w:type="dxa" w:w="2351"/>
+            <w:shd w:val="clear" w:color="auto" w:fill="FFC7CE"/>
+            <w:tcBorders>
+              <w:top w:val="single" w:sz="4" w:color="CCCCCC"/>
+              <w:left w:val="single" w:sz="4" w:color="CCCCCC"/>
+              <w:bottom w:val="single" w:sz="4" w:color="CCCCCC"/>
+              <w:right w:val="single" w:sz="4" w:color="CCCCCC"/>
+            </w:tcBorders>
+          </w:tcPr>
+          <w:p>
+            <w:pPr>
+              <w:jc w:val="center"/>
+            </w:pPr>
+            <w:r>
+              <w:t>0.6000</w:t>
+            </w:r>
+          </w:p>
+        </w:tc>
+        <w:tc>
+          <w:tcPr>
+            <w:tcW w:type="dxa" w:w="2351"/>
+            <w:shd w:val="clear" w:color="auto" w:fill="FFC7CE"/>
+            <w:tcBorders>
+              <w:top w:val="single" w:sz="4" w:color="CCCCCC"/>
+              <w:left w:val="single" w:sz="4" w:color="CCCCCC"/>
+              <w:bottom w:val="single" w:sz="4" w:color="CCCCCC"/>
+              <w:right w:val="single" w:sz="4" w:color="CCCCCC"/>
+            </w:tcBorders>
+          </w:tcPr>
+          <w:p>
+            <w:pPr>
+              <w:jc w:val="center"/>
+            </w:pPr>
+            <w:r>
+              <w:t>0.6000</w:t>
+            </w:r>
+          </w:p>
+        </w:tc>
+      </w:tr>
+      <w:tr>
+        <w:tc>
+          <w:tcPr>
+            <w:tcW w:type="dxa" w:w="2351"/>
+            <w:tcBorders>
+              <w:top w:val="single" w:sz="4" w:color="CCCCCC"/>
+              <w:left w:val="single" w:sz="4" w:color="CCCCCC"/>
+              <w:bottom w:val="single" w:sz="4" w:color="CCCCCC"/>
+              <w:right w:val="single" w:sz="4" w:color="CCCCCC"/>
+            </w:tcBorders>
+          </w:tcPr>
+          <w:p>
+            <w:r>
+              <w:t>Tuyển sinh</w:t>
+            </w:r>
+          </w:p>
+        </w:tc>
+        <w:tc>
+          <w:tcPr>
+            <w:tcW w:type="dxa" w:w="2351"/>
+            <w:shd w:val="clear" w:color="auto" w:fill="FFEB9C"/>
+            <w:tcBorders>
+              <w:top w:val="single" w:sz="4" w:color="CCCCCC"/>
+              <w:left w:val="single" w:sz="4" w:color="CCCCCC"/>
+              <w:bottom w:val="single" w:sz="4" w:color="CCCCCC"/>
+              <w:right w:val="single" w:sz="4" w:color="CCCCCC"/>
+            </w:tcBorders>
+          </w:tcPr>
+          <w:p>
+            <w:pPr>
+              <w:jc w:val="center"/>
+            </w:pPr>
+            <w:r>
+              <w:t>0.7713</w:t>
+            </w:r>
+          </w:p>
+        </w:tc>
+        <w:tc>
+          <w:tcPr>
+            <w:tcW w:type="dxa" w:w="2351"/>
+            <w:shd w:val="clear" w:color="auto" w:fill="FFEB9C"/>
+            <w:tcBorders>
+              <w:top w:val="single" w:sz="4" w:color="CCCCCC"/>
+              <w:left w:val="single" w:sz="4" w:color="CCCCCC"/>
+              <w:bottom w:val="single" w:sz="4" w:color="CCCCCC"/>
+              <w:right w:val="single" w:sz="4" w:color="CCCCCC"/>
+            </w:tcBorders>
+          </w:tcPr>
+          <w:p>
+            <w:pPr>
+              <w:jc w:val="center"/>
+            </w:pPr>
+            <w:r>
+              <w:t>0.7812</w:t>
+            </w:r>
+          </w:p>
+        </w:tc>
+        <w:tc>
+          <w:tcPr>
+            <w:tcW w:type="dxa" w:w="2351"/>
+            <w:shd w:val="clear" w:color="auto" w:fill="C6EFCE"/>
+            <w:tcBorders>
+              <w:top w:val="single" w:sz="4" w:color="CCCCCC"/>
+              <w:left w:val="single" w:sz="4" w:color="CCCCCC"/>
+              <w:bottom w:val="single" w:sz="4" w:color="CCCCCC"/>
+              <w:right w:val="single" w:sz="4" w:color="CCCCCC"/>
+            </w:tcBorders>
+          </w:tcPr>
+          <w:p>
+            <w:pPr>
+              <w:jc w:val="center"/>
+            </w:pPr>
+            <w:r>
+              <w:t>0.8500</w:t>
             </w:r>
           </w:p>
         </w:tc>
@@ -2809,6 +3528,647 @@
         <w:rPr>
           <w:b/>
         </w:rPr>
+        <w:t>Retrieval Rank Metrics (Auepora):</w:t>
+      </w:r>
+    </w:p>
+    <w:tbl>
+      <w:tblPr>
+        <w:tblStyle w:val="TableGrid"/>
+        <w:tblW w:type="auto" w:w="0"/>
+        <w:tblLook w:firstColumn="1" w:firstRow="1" w:lastColumn="0" w:lastRow="0" w:noHBand="0" w:noVBand="1" w:val="04A0"/>
+      </w:tblPr>
+      <w:tblGrid>
+        <w:gridCol w:w="3135"/>
+        <w:gridCol w:w="3135"/>
+        <w:gridCol w:w="3135"/>
+      </w:tblGrid>
+      <w:tr>
+        <w:tc>
+          <w:tcPr>
+            <w:tcW w:type="dxa" w:w="3135"/>
+            <w:shd w:val="clear" w:color="auto" w:fill="375623"/>
+          </w:tcPr>
+          <w:p>
+            <w:r>
+              <w:rPr>
+                <w:b/>
+                <w:color w:val="FFFFFF"/>
+              </w:rPr>
+              <w:t>Metric</w:t>
+            </w:r>
+          </w:p>
+        </w:tc>
+        <w:tc>
+          <w:tcPr>
+            <w:tcW w:type="dxa" w:w="3135"/>
+            <w:shd w:val="clear" w:color="auto" w:fill="375623"/>
+          </w:tcPr>
+          <w:p>
+            <w:r>
+              <w:rPr>
+                <w:b/>
+                <w:color w:val="FFFFFF"/>
+              </w:rPr>
+              <w:t>Điểm</w:t>
+            </w:r>
+          </w:p>
+        </w:tc>
+        <w:tc>
+          <w:tcPr>
+            <w:tcW w:type="dxa" w:w="3135"/>
+            <w:shd w:val="clear" w:color="auto" w:fill="375623"/>
+          </w:tcPr>
+          <w:p>
+            <w:r>
+              <w:rPr>
+                <w:b/>
+                <w:color w:val="FFFFFF"/>
+              </w:rPr>
+              <w:t>Đánh giá</w:t>
+            </w:r>
+          </w:p>
+        </w:tc>
+      </w:tr>
+      <w:tr>
+        <w:tc>
+          <w:tcPr>
+            <w:tcW w:type="dxa" w:w="3135"/>
+            <w:shd w:val="clear" w:color="auto" w:fill="FFC7CE"/>
+            <w:tcBorders>
+              <w:top w:val="single" w:sz="4" w:color="CCCCCC"/>
+              <w:left w:val="single" w:sz="4" w:color="CCCCCC"/>
+              <w:bottom w:val="single" w:sz="4" w:color="CCCCCC"/>
+              <w:right w:val="single" w:sz="4" w:color="CCCCCC"/>
+            </w:tcBorders>
+          </w:tcPr>
+          <w:p>
+            <w:r>
+              <w:t>MAP@10</w:t>
+            </w:r>
+          </w:p>
+        </w:tc>
+        <w:tc>
+          <w:tcPr>
+            <w:tcW w:type="dxa" w:w="3135"/>
+            <w:shd w:val="clear" w:color="auto" w:fill="FFC7CE"/>
+            <w:tcBorders>
+              <w:top w:val="single" w:sz="4" w:color="CCCCCC"/>
+              <w:left w:val="single" w:sz="4" w:color="CCCCCC"/>
+              <w:bottom w:val="single" w:sz="4" w:color="CCCCCC"/>
+              <w:right w:val="single" w:sz="4" w:color="CCCCCC"/>
+            </w:tcBorders>
+          </w:tcPr>
+          <w:p>
+            <w:pPr>
+              <w:jc w:val="center"/>
+            </w:pPr>
+            <w:r>
+              <w:t>0.4737</w:t>
+            </w:r>
+          </w:p>
+        </w:tc>
+        <w:tc>
+          <w:tcPr>
+            <w:tcW w:type="dxa" w:w="3135"/>
+            <w:shd w:val="clear" w:color="auto" w:fill="FFC7CE"/>
+            <w:tcBorders>
+              <w:top w:val="single" w:sz="4" w:color="CCCCCC"/>
+              <w:left w:val="single" w:sz="4" w:color="CCCCCC"/>
+              <w:bottom w:val="single" w:sz="4" w:color="CCCCCC"/>
+              <w:right w:val="single" w:sz="4" w:color="CCCCCC"/>
+            </w:tcBorders>
+          </w:tcPr>
+          <w:p>
+            <w:pPr>
+              <w:jc w:val="center"/>
+            </w:pPr>
+            <w:r>
+              <w:t>Cần cải thiện</w:t>
+            </w:r>
+          </w:p>
+        </w:tc>
+      </w:tr>
+      <w:tr>
+        <w:tc>
+          <w:tcPr>
+            <w:tcW w:type="dxa" w:w="3135"/>
+            <w:shd w:val="clear" w:color="auto" w:fill="FFC7CE"/>
+            <w:tcBorders>
+              <w:top w:val="single" w:sz="4" w:color="CCCCCC"/>
+              <w:left w:val="single" w:sz="4" w:color="CCCCCC"/>
+              <w:bottom w:val="single" w:sz="4" w:color="CCCCCC"/>
+              <w:right w:val="single" w:sz="4" w:color="CCCCCC"/>
+            </w:tcBorders>
+          </w:tcPr>
+          <w:p>
+            <w:r>
+              <w:t>MRR</w:t>
+            </w:r>
+          </w:p>
+        </w:tc>
+        <w:tc>
+          <w:tcPr>
+            <w:tcW w:type="dxa" w:w="3135"/>
+            <w:shd w:val="clear" w:color="auto" w:fill="FFC7CE"/>
+            <w:tcBorders>
+              <w:top w:val="single" w:sz="4" w:color="CCCCCC"/>
+              <w:left w:val="single" w:sz="4" w:color="CCCCCC"/>
+              <w:bottom w:val="single" w:sz="4" w:color="CCCCCC"/>
+              <w:right w:val="single" w:sz="4" w:color="CCCCCC"/>
+            </w:tcBorders>
+          </w:tcPr>
+          <w:p>
+            <w:pPr>
+              <w:jc w:val="center"/>
+            </w:pPr>
+            <w:r>
+              <w:t>0.5055</w:t>
+            </w:r>
+          </w:p>
+        </w:tc>
+        <w:tc>
+          <w:tcPr>
+            <w:tcW w:type="dxa" w:w="3135"/>
+            <w:shd w:val="clear" w:color="auto" w:fill="FFC7CE"/>
+            <w:tcBorders>
+              <w:top w:val="single" w:sz="4" w:color="CCCCCC"/>
+              <w:left w:val="single" w:sz="4" w:color="CCCCCC"/>
+              <w:bottom w:val="single" w:sz="4" w:color="CCCCCC"/>
+              <w:right w:val="single" w:sz="4" w:color="CCCCCC"/>
+            </w:tcBorders>
+          </w:tcPr>
+          <w:p>
+            <w:pPr>
+              <w:jc w:val="center"/>
+            </w:pPr>
+            <w:r>
+              <w:t>Cần cải thiện</w:t>
+            </w:r>
+          </w:p>
+        </w:tc>
+      </w:tr>
+      <w:tr>
+        <w:tc>
+          <w:tcPr>
+            <w:tcW w:type="dxa" w:w="3135"/>
+            <w:shd w:val="clear" w:color="auto" w:fill="FFC7CE"/>
+            <w:tcBorders>
+              <w:top w:val="single" w:sz="4" w:color="CCCCCC"/>
+              <w:left w:val="single" w:sz="4" w:color="CCCCCC"/>
+              <w:bottom w:val="single" w:sz="4" w:color="CCCCCC"/>
+              <w:right w:val="single" w:sz="4" w:color="CCCCCC"/>
+            </w:tcBorders>
+          </w:tcPr>
+          <w:p>
+            <w:r>
+              <w:t>Hit@10</w:t>
+            </w:r>
+          </w:p>
+        </w:tc>
+        <w:tc>
+          <w:tcPr>
+            <w:tcW w:type="dxa" w:w="3135"/>
+            <w:shd w:val="clear" w:color="auto" w:fill="FFC7CE"/>
+            <w:tcBorders>
+              <w:top w:val="single" w:sz="4" w:color="CCCCCC"/>
+              <w:left w:val="single" w:sz="4" w:color="CCCCCC"/>
+              <w:bottom w:val="single" w:sz="4" w:color="CCCCCC"/>
+              <w:right w:val="single" w:sz="4" w:color="CCCCCC"/>
+            </w:tcBorders>
+          </w:tcPr>
+          <w:p>
+            <w:pPr>
+              <w:jc w:val="center"/>
+            </w:pPr>
+            <w:r>
+              <w:t>0.6200</w:t>
+            </w:r>
+          </w:p>
+        </w:tc>
+        <w:tc>
+          <w:tcPr>
+            <w:tcW w:type="dxa" w:w="3135"/>
+            <w:shd w:val="clear" w:color="auto" w:fill="FFC7CE"/>
+            <w:tcBorders>
+              <w:top w:val="single" w:sz="4" w:color="CCCCCC"/>
+              <w:left w:val="single" w:sz="4" w:color="CCCCCC"/>
+              <w:bottom w:val="single" w:sz="4" w:color="CCCCCC"/>
+              <w:right w:val="single" w:sz="4" w:color="CCCCCC"/>
+            </w:tcBorders>
+          </w:tcPr>
+          <w:p>
+            <w:pPr>
+              <w:jc w:val="center"/>
+            </w:pPr>
+            <w:r>
+              <w:t>Khá</w:t>
+            </w:r>
+          </w:p>
+        </w:tc>
+      </w:tr>
+    </w:tbl>
+    <w:p/>
+    <w:p>
+      <w:r>
+        <w:rPr>
+          <w:b/>
+        </w:rPr>
+        <w:t>Retrieval Rank Metrics theo danh mục (k=10):</w:t>
+      </w:r>
+    </w:p>
+    <w:tbl>
+      <w:tblPr>
+        <w:tblStyle w:val="TableGrid"/>
+        <w:tblW w:type="auto" w:w="0"/>
+        <w:tblLook w:firstColumn="1" w:firstRow="1" w:lastColumn="0" w:lastRow="0" w:noHBand="0" w:noVBand="1" w:val="04A0"/>
+      </w:tblPr>
+      <w:tblGrid>
+        <w:gridCol w:w="2351"/>
+        <w:gridCol w:w="2351"/>
+        <w:gridCol w:w="2351"/>
+        <w:gridCol w:w="2351"/>
+      </w:tblGrid>
+      <w:tr>
+        <w:tc>
+          <w:tcPr>
+            <w:tcW w:type="dxa" w:w="2351"/>
+            <w:shd w:val="clear" w:color="auto" w:fill="375623"/>
+          </w:tcPr>
+          <w:p>
+            <w:r>
+              <w:rPr>
+                <w:b/>
+                <w:color w:val="FFFFFF"/>
+              </w:rPr>
+              <w:t>Danh mục</w:t>
+            </w:r>
+          </w:p>
+        </w:tc>
+        <w:tc>
+          <w:tcPr>
+            <w:tcW w:type="dxa" w:w="2351"/>
+            <w:shd w:val="clear" w:color="auto" w:fill="375623"/>
+          </w:tcPr>
+          <w:p>
+            <w:r>
+              <w:rPr>
+                <w:b/>
+                <w:color w:val="FFFFFF"/>
+              </w:rPr>
+              <w:t>MAP@10</w:t>
+            </w:r>
+          </w:p>
+        </w:tc>
+        <w:tc>
+          <w:tcPr>
+            <w:tcW w:type="dxa" w:w="2351"/>
+            <w:shd w:val="clear" w:color="auto" w:fill="375623"/>
+          </w:tcPr>
+          <w:p>
+            <w:r>
+              <w:rPr>
+                <w:b/>
+                <w:color w:val="FFFFFF"/>
+              </w:rPr>
+              <w:t>MRR</w:t>
+            </w:r>
+          </w:p>
+        </w:tc>
+        <w:tc>
+          <w:tcPr>
+            <w:tcW w:type="dxa" w:w="2351"/>
+            <w:shd w:val="clear" w:color="auto" w:fill="375623"/>
+          </w:tcPr>
+          <w:p>
+            <w:r>
+              <w:rPr>
+                <w:b/>
+                <w:color w:val="FFFFFF"/>
+              </w:rPr>
+              <w:t>Hit@10</w:t>
+            </w:r>
+          </w:p>
+        </w:tc>
+      </w:tr>
+      <w:tr>
+        <w:tc>
+          <w:tcPr>
+            <w:tcW w:type="dxa" w:w="2351"/>
+            <w:tcBorders>
+              <w:top w:val="single" w:sz="4" w:color="CCCCCC"/>
+              <w:left w:val="single" w:sz="4" w:color="CCCCCC"/>
+              <w:bottom w:val="single" w:sz="4" w:color="CCCCCC"/>
+              <w:right w:val="single" w:sz="4" w:color="CCCCCC"/>
+            </w:tcBorders>
+          </w:tcPr>
+          <w:p>
+            <w:r>
+              <w:t>Chương trình đào tạo (CTĐT)</w:t>
+            </w:r>
+          </w:p>
+        </w:tc>
+        <w:tc>
+          <w:tcPr>
+            <w:tcW w:type="dxa" w:w="2351"/>
+            <w:shd w:val="clear" w:color="auto" w:fill="FFC7CE"/>
+            <w:tcBorders>
+              <w:top w:val="single" w:sz="4" w:color="CCCCCC"/>
+              <w:left w:val="single" w:sz="4" w:color="CCCCCC"/>
+              <w:bottom w:val="single" w:sz="4" w:color="CCCCCC"/>
+              <w:right w:val="single" w:sz="4" w:color="CCCCCC"/>
+            </w:tcBorders>
+          </w:tcPr>
+          <w:p>
+            <w:pPr>
+              <w:jc w:val="center"/>
+            </w:pPr>
+            <w:r>
+              <w:t>0.3378</w:t>
+            </w:r>
+          </w:p>
+        </w:tc>
+        <w:tc>
+          <w:tcPr>
+            <w:tcW w:type="dxa" w:w="2351"/>
+            <w:shd w:val="clear" w:color="auto" w:fill="FFC7CE"/>
+            <w:tcBorders>
+              <w:top w:val="single" w:sz="4" w:color="CCCCCC"/>
+              <w:left w:val="single" w:sz="4" w:color="CCCCCC"/>
+              <w:bottom w:val="single" w:sz="4" w:color="CCCCCC"/>
+              <w:right w:val="single" w:sz="4" w:color="CCCCCC"/>
+            </w:tcBorders>
+          </w:tcPr>
+          <w:p>
+            <w:pPr>
+              <w:jc w:val="center"/>
+            </w:pPr>
+            <w:r>
+              <w:t>0.3643</w:t>
+            </w:r>
+          </w:p>
+        </w:tc>
+        <w:tc>
+          <w:tcPr>
+            <w:tcW w:type="dxa" w:w="2351"/>
+            <w:shd w:val="clear" w:color="auto" w:fill="FFC7CE"/>
+            <w:tcBorders>
+              <w:top w:val="single" w:sz="4" w:color="CCCCCC"/>
+              <w:left w:val="single" w:sz="4" w:color="CCCCCC"/>
+              <w:bottom w:val="single" w:sz="4" w:color="CCCCCC"/>
+              <w:right w:val="single" w:sz="4" w:color="CCCCCC"/>
+            </w:tcBorders>
+          </w:tcPr>
+          <w:p>
+            <w:pPr>
+              <w:jc w:val="center"/>
+            </w:pPr>
+            <w:r>
+              <w:t>0.4286</w:t>
+            </w:r>
+          </w:p>
+        </w:tc>
+      </w:tr>
+      <w:tr>
+        <w:tc>
+          <w:tcPr>
+            <w:tcW w:type="dxa" w:w="2351"/>
+            <w:tcBorders>
+              <w:top w:val="single" w:sz="4" w:color="CCCCCC"/>
+              <w:left w:val="single" w:sz="4" w:color="CCCCCC"/>
+              <w:bottom w:val="single" w:sz="4" w:color="CCCCCC"/>
+              <w:right w:val="single" w:sz="4" w:color="CCCCCC"/>
+            </w:tcBorders>
+          </w:tcPr>
+          <w:p>
+            <w:r>
+              <w:t>Học phí</w:t>
+            </w:r>
+          </w:p>
+        </w:tc>
+        <w:tc>
+          <w:tcPr>
+            <w:tcW w:type="dxa" w:w="2351"/>
+            <w:shd w:val="clear" w:color="auto" w:fill="FFEB9C"/>
+            <w:tcBorders>
+              <w:top w:val="single" w:sz="4" w:color="CCCCCC"/>
+              <w:left w:val="single" w:sz="4" w:color="CCCCCC"/>
+              <w:bottom w:val="single" w:sz="4" w:color="CCCCCC"/>
+              <w:right w:val="single" w:sz="4" w:color="CCCCCC"/>
+            </w:tcBorders>
+          </w:tcPr>
+          <w:p>
+            <w:pPr>
+              <w:jc w:val="center"/>
+            </w:pPr>
+            <w:r>
+              <w:t>0.7952</w:t>
+            </w:r>
+          </w:p>
+        </w:tc>
+        <w:tc>
+          <w:tcPr>
+            <w:tcW w:type="dxa" w:w="2351"/>
+            <w:shd w:val="clear" w:color="auto" w:fill="C6EFCE"/>
+            <w:tcBorders>
+              <w:top w:val="single" w:sz="4" w:color="CCCCCC"/>
+              <w:left w:val="single" w:sz="4" w:color="CCCCCC"/>
+              <w:bottom w:val="single" w:sz="4" w:color="CCCCCC"/>
+              <w:right w:val="single" w:sz="4" w:color="CCCCCC"/>
+            </w:tcBorders>
+          </w:tcPr>
+          <w:p>
+            <w:pPr>
+              <w:jc w:val="center"/>
+            </w:pPr>
+            <w:r>
+              <w:t>0.9000</w:t>
+            </w:r>
+          </w:p>
+        </w:tc>
+        <w:tc>
+          <w:tcPr>
+            <w:tcW w:type="dxa" w:w="2351"/>
+            <w:shd w:val="clear" w:color="auto" w:fill="C6EFCE"/>
+            <w:tcBorders>
+              <w:top w:val="single" w:sz="4" w:color="CCCCCC"/>
+              <w:left w:val="single" w:sz="4" w:color="CCCCCC"/>
+              <w:bottom w:val="single" w:sz="4" w:color="CCCCCC"/>
+              <w:right w:val="single" w:sz="4" w:color="CCCCCC"/>
+            </w:tcBorders>
+          </w:tcPr>
+          <w:p>
+            <w:pPr>
+              <w:jc w:val="center"/>
+            </w:pPr>
+            <w:r>
+              <w:t>0.9000</w:t>
+            </w:r>
+          </w:p>
+        </w:tc>
+      </w:tr>
+      <w:tr>
+        <w:tc>
+          <w:tcPr>
+            <w:tcW w:type="dxa" w:w="2351"/>
+            <w:tcBorders>
+              <w:top w:val="single" w:sz="4" w:color="CCCCCC"/>
+              <w:left w:val="single" w:sz="4" w:color="CCCCCC"/>
+              <w:bottom w:val="single" w:sz="4" w:color="CCCCCC"/>
+              <w:right w:val="single" w:sz="4" w:color="CCCCCC"/>
+            </w:tcBorders>
+          </w:tcPr>
+          <w:p>
+            <w:r>
+              <w:t>Học vụ</w:t>
+            </w:r>
+          </w:p>
+        </w:tc>
+        <w:tc>
+          <w:tcPr>
+            <w:tcW w:type="dxa" w:w="2351"/>
+            <w:shd w:val="clear" w:color="auto" w:fill="FFC7CE"/>
+            <w:tcBorders>
+              <w:top w:val="single" w:sz="4" w:color="CCCCCC"/>
+              <w:left w:val="single" w:sz="4" w:color="CCCCCC"/>
+              <w:bottom w:val="single" w:sz="4" w:color="CCCCCC"/>
+              <w:right w:val="single" w:sz="4" w:color="CCCCCC"/>
+            </w:tcBorders>
+          </w:tcPr>
+          <w:p>
+            <w:pPr>
+              <w:jc w:val="center"/>
+            </w:pPr>
+            <w:r>
+              <w:t>0.4062</w:t>
+            </w:r>
+          </w:p>
+        </w:tc>
+        <w:tc>
+          <w:tcPr>
+            <w:tcW w:type="dxa" w:w="2351"/>
+            <w:shd w:val="clear" w:color="auto" w:fill="FFC7CE"/>
+            <w:tcBorders>
+              <w:top w:val="single" w:sz="4" w:color="CCCCCC"/>
+              <w:left w:val="single" w:sz="4" w:color="CCCCCC"/>
+              <w:bottom w:val="single" w:sz="4" w:color="CCCCCC"/>
+              <w:right w:val="single" w:sz="4" w:color="CCCCCC"/>
+            </w:tcBorders>
+          </w:tcPr>
+          <w:p>
+            <w:pPr>
+              <w:jc w:val="center"/>
+            </w:pPr>
+            <w:r>
+              <w:t>0.4251</w:t>
+            </w:r>
+          </w:p>
+        </w:tc>
+        <w:tc>
+          <w:tcPr>
+            <w:tcW w:type="dxa" w:w="2351"/>
+            <w:shd w:val="clear" w:color="auto" w:fill="FFC7CE"/>
+            <w:tcBorders>
+              <w:top w:val="single" w:sz="4" w:color="CCCCCC"/>
+              <w:left w:val="single" w:sz="4" w:color="CCCCCC"/>
+              <w:bottom w:val="single" w:sz="4" w:color="CCCCCC"/>
+              <w:right w:val="single" w:sz="4" w:color="CCCCCC"/>
+            </w:tcBorders>
+          </w:tcPr>
+          <w:p>
+            <w:pPr>
+              <w:jc w:val="center"/>
+            </w:pPr>
+            <w:r>
+              <w:t>0.6364</w:t>
+            </w:r>
+          </w:p>
+        </w:tc>
+      </w:tr>
+      <w:tr>
+        <w:tc>
+          <w:tcPr>
+            <w:tcW w:type="dxa" w:w="2351"/>
+            <w:tcBorders>
+              <w:top w:val="single" w:sz="4" w:color="CCCCCC"/>
+              <w:left w:val="single" w:sz="4" w:color="CCCCCC"/>
+              <w:bottom w:val="single" w:sz="4" w:color="CCCCCC"/>
+              <w:right w:val="single" w:sz="4" w:color="CCCCCC"/>
+            </w:tcBorders>
+          </w:tcPr>
+          <w:p>
+            <w:r>
+              <w:t>Quy chế</w:t>
+            </w:r>
+          </w:p>
+        </w:tc>
+        <w:tc>
+          <w:tcPr>
+            <w:tcW w:type="dxa" w:w="2351"/>
+            <w:shd w:val="clear" w:color="auto" w:fill="FFC7CE"/>
+            <w:tcBorders>
+              <w:top w:val="single" w:sz="4" w:color="CCCCCC"/>
+              <w:left w:val="single" w:sz="4" w:color="CCCCCC"/>
+              <w:bottom w:val="single" w:sz="4" w:color="CCCCCC"/>
+              <w:right w:val="single" w:sz="4" w:color="CCCCCC"/>
+            </w:tcBorders>
+          </w:tcPr>
+          <w:p>
+            <w:pPr>
+              <w:jc w:val="center"/>
+            </w:pPr>
+            <w:r>
+              <w:t>0.4358</w:t>
+            </w:r>
+          </w:p>
+        </w:tc>
+        <w:tc>
+          <w:tcPr>
+            <w:tcW w:type="dxa" w:w="2351"/>
+            <w:shd w:val="clear" w:color="auto" w:fill="FFC7CE"/>
+            <w:tcBorders>
+              <w:top w:val="single" w:sz="4" w:color="CCCCCC"/>
+              <w:left w:val="single" w:sz="4" w:color="CCCCCC"/>
+              <w:bottom w:val="single" w:sz="4" w:color="CCCCCC"/>
+              <w:right w:val="single" w:sz="4" w:color="CCCCCC"/>
+            </w:tcBorders>
+          </w:tcPr>
+          <w:p>
+            <w:pPr>
+              <w:jc w:val="center"/>
+            </w:pPr>
+            <w:r>
+              <w:t>0.4333</w:t>
+            </w:r>
+          </w:p>
+        </w:tc>
+        <w:tc>
+          <w:tcPr>
+            <w:tcW w:type="dxa" w:w="2351"/>
+            <w:shd w:val="clear" w:color="auto" w:fill="FFC7CE"/>
+            <w:tcBorders>
+              <w:top w:val="single" w:sz="4" w:color="CCCCCC"/>
+              <w:left w:val="single" w:sz="4" w:color="CCCCCC"/>
+              <w:bottom w:val="single" w:sz="4" w:color="CCCCCC"/>
+              <w:right w:val="single" w:sz="4" w:color="CCCCCC"/>
+            </w:tcBorders>
+          </w:tcPr>
+          <w:p>
+            <w:pPr>
+              <w:jc w:val="center"/>
+            </w:pPr>
+            <w:r>
+              <w:t>0.6000</w:t>
+            </w:r>
+          </w:p>
+        </w:tc>
+      </w:tr>
+    </w:tbl>
+    <w:p/>
+    <w:p>
+      <w:r>
+        <w:rPr>
+          <w:b/>
+        </w:rPr>
         <w:t>Theo danh mục:</w:t>
       </w:r>
     </w:p>
@@ -4454,6 +5814,318 @@
     </w:tbl>
     <w:p/>
     <w:p>
+      <w:r>
+        <w:rPr>
+          <w:b/>
+        </w:rPr>
+        <w:t>4.2 So sánh Retrieval Rank Metrics:</w:t>
+      </w:r>
+    </w:p>
+    <w:tbl>
+      <w:tblPr>
+        <w:tblStyle w:val="TableGrid"/>
+        <w:tblW w:type="auto" w:w="0"/>
+        <w:tblLook w:firstColumn="1" w:firstRow="1" w:lastColumn="0" w:lastRow="0" w:noHBand="0" w:noVBand="1" w:val="04A0"/>
+      </w:tblPr>
+      <w:tblGrid>
+        <w:gridCol w:w="2351"/>
+        <w:gridCol w:w="2351"/>
+        <w:gridCol w:w="2351"/>
+        <w:gridCol w:w="2351"/>
+      </w:tblGrid>
+      <w:tr>
+        <w:tc>
+          <w:tcPr>
+            <w:tcW w:type="dxa" w:w="2351"/>
+            <w:shd w:val="clear" w:color="auto" w:fill="375623"/>
+          </w:tcPr>
+          <w:p>
+            <w:r>
+              <w:rPr>
+                <w:b/>
+                <w:color w:val="FFFFFF"/>
+              </w:rPr>
+              <w:t>Metric</w:t>
+            </w:r>
+          </w:p>
+        </w:tc>
+        <w:tc>
+          <w:tcPr>
+            <w:tcW w:type="dxa" w:w="2351"/>
+            <w:shd w:val="clear" w:color="auto" w:fill="375623"/>
+          </w:tcPr>
+          <w:p>
+            <w:r>
+              <w:rPr>
+                <w:b/>
+                <w:color w:val="FFFFFF"/>
+              </w:rPr>
+              <w:t>Batch 1</w:t>
+            </w:r>
+          </w:p>
+        </w:tc>
+        <w:tc>
+          <w:tcPr>
+            <w:tcW w:type="dxa" w:w="2351"/>
+            <w:shd w:val="clear" w:color="auto" w:fill="375623"/>
+          </w:tcPr>
+          <w:p>
+            <w:r>
+              <w:rPr>
+                <w:b/>
+                <w:color w:val="FFFFFF"/>
+              </w:rPr>
+              <w:t>Batch 2</w:t>
+            </w:r>
+          </w:p>
+        </w:tc>
+        <w:tc>
+          <w:tcPr>
+            <w:tcW w:type="dxa" w:w="2351"/>
+            <w:shd w:val="clear" w:color="auto" w:fill="375623"/>
+          </w:tcPr>
+          <w:p>
+            <w:r>
+              <w:rPr>
+                <w:b/>
+                <w:color w:val="FFFFFF"/>
+              </w:rPr>
+              <w:t>Chênh lệch</w:t>
+            </w:r>
+          </w:p>
+        </w:tc>
+      </w:tr>
+      <w:tr>
+        <w:tc>
+          <w:tcPr>
+            <w:tcW w:type="dxa" w:w="2351"/>
+            <w:tcBorders>
+              <w:top w:val="single" w:sz="4" w:color="CCCCCC"/>
+              <w:left w:val="single" w:sz="4" w:color="CCCCCC"/>
+              <w:bottom w:val="single" w:sz="4" w:color="CCCCCC"/>
+              <w:right w:val="single" w:sz="4" w:color="CCCCCC"/>
+            </w:tcBorders>
+          </w:tcPr>
+          <w:p>
+            <w:r>
+              <w:t>MAP@10</w:t>
+            </w:r>
+          </w:p>
+        </w:tc>
+        <w:tc>
+          <w:tcPr>
+            <w:tcW w:type="dxa" w:w="2351"/>
+            <w:tcBorders>
+              <w:top w:val="single" w:sz="4" w:color="CCCCCC"/>
+              <w:left w:val="single" w:sz="4" w:color="CCCCCC"/>
+              <w:bottom w:val="single" w:sz="4" w:color="CCCCCC"/>
+              <w:right w:val="single" w:sz="4" w:color="CCCCCC"/>
+            </w:tcBorders>
+          </w:tcPr>
+          <w:p>
+            <w:pPr>
+              <w:jc w:val="center"/>
+            </w:pPr>
+            <w:r>
+              <w:t>0.6959</w:t>
+            </w:r>
+          </w:p>
+        </w:tc>
+        <w:tc>
+          <w:tcPr>
+            <w:tcW w:type="dxa" w:w="2351"/>
+            <w:tcBorders>
+              <w:top w:val="single" w:sz="4" w:color="CCCCCC"/>
+              <w:left w:val="single" w:sz="4" w:color="CCCCCC"/>
+              <w:bottom w:val="single" w:sz="4" w:color="CCCCCC"/>
+              <w:right w:val="single" w:sz="4" w:color="CCCCCC"/>
+            </w:tcBorders>
+          </w:tcPr>
+          <w:p>
+            <w:pPr>
+              <w:jc w:val="center"/>
+            </w:pPr>
+            <w:r>
+              <w:t>0.4737</w:t>
+            </w:r>
+          </w:p>
+        </w:tc>
+        <w:tc>
+          <w:tcPr>
+            <w:tcW w:type="dxa" w:w="2351"/>
+            <w:shd w:val="clear" w:color="auto" w:fill="FFC7CE"/>
+            <w:tcBorders>
+              <w:top w:val="single" w:sz="4" w:color="CCCCCC"/>
+              <w:left w:val="single" w:sz="4" w:color="CCCCCC"/>
+              <w:bottom w:val="single" w:sz="4" w:color="CCCCCC"/>
+              <w:right w:val="single" w:sz="4" w:color="CCCCCC"/>
+            </w:tcBorders>
+          </w:tcPr>
+          <w:p>
+            <w:pPr>
+              <w:jc w:val="center"/>
+            </w:pPr>
+            <w:r>
+              <w:t>-0.2222</w:t>
+            </w:r>
+          </w:p>
+        </w:tc>
+      </w:tr>
+      <w:tr>
+        <w:tc>
+          <w:tcPr>
+            <w:tcW w:type="dxa" w:w="2351"/>
+            <w:tcBorders>
+              <w:top w:val="single" w:sz="4" w:color="CCCCCC"/>
+              <w:left w:val="single" w:sz="4" w:color="CCCCCC"/>
+              <w:bottom w:val="single" w:sz="4" w:color="CCCCCC"/>
+              <w:right w:val="single" w:sz="4" w:color="CCCCCC"/>
+            </w:tcBorders>
+          </w:tcPr>
+          <w:p>
+            <w:r>
+              <w:t>MRR</w:t>
+            </w:r>
+          </w:p>
+        </w:tc>
+        <w:tc>
+          <w:tcPr>
+            <w:tcW w:type="dxa" w:w="2351"/>
+            <w:tcBorders>
+              <w:top w:val="single" w:sz="4" w:color="CCCCCC"/>
+              <w:left w:val="single" w:sz="4" w:color="CCCCCC"/>
+              <w:bottom w:val="single" w:sz="4" w:color="CCCCCC"/>
+              <w:right w:val="single" w:sz="4" w:color="CCCCCC"/>
+            </w:tcBorders>
+          </w:tcPr>
+          <w:p>
+            <w:pPr>
+              <w:jc w:val="center"/>
+            </w:pPr>
+            <w:r>
+              <w:t>0.7287</w:t>
+            </w:r>
+          </w:p>
+        </w:tc>
+        <w:tc>
+          <w:tcPr>
+            <w:tcW w:type="dxa" w:w="2351"/>
+            <w:tcBorders>
+              <w:top w:val="single" w:sz="4" w:color="CCCCCC"/>
+              <w:left w:val="single" w:sz="4" w:color="CCCCCC"/>
+              <w:bottom w:val="single" w:sz="4" w:color="CCCCCC"/>
+              <w:right w:val="single" w:sz="4" w:color="CCCCCC"/>
+            </w:tcBorders>
+          </w:tcPr>
+          <w:p>
+            <w:pPr>
+              <w:jc w:val="center"/>
+            </w:pPr>
+            <w:r>
+              <w:t>0.5055</w:t>
+            </w:r>
+          </w:p>
+        </w:tc>
+        <w:tc>
+          <w:tcPr>
+            <w:tcW w:type="dxa" w:w="2351"/>
+            <w:shd w:val="clear" w:color="auto" w:fill="FFC7CE"/>
+            <w:tcBorders>
+              <w:top w:val="single" w:sz="4" w:color="CCCCCC"/>
+              <w:left w:val="single" w:sz="4" w:color="CCCCCC"/>
+              <w:bottom w:val="single" w:sz="4" w:color="CCCCCC"/>
+              <w:right w:val="single" w:sz="4" w:color="CCCCCC"/>
+            </w:tcBorders>
+          </w:tcPr>
+          <w:p>
+            <w:pPr>
+              <w:jc w:val="center"/>
+            </w:pPr>
+            <w:r>
+              <w:t>-0.2232</w:t>
+            </w:r>
+          </w:p>
+        </w:tc>
+      </w:tr>
+      <w:tr>
+        <w:tc>
+          <w:tcPr>
+            <w:tcW w:type="dxa" w:w="2351"/>
+            <w:tcBorders>
+              <w:top w:val="single" w:sz="4" w:color="CCCCCC"/>
+              <w:left w:val="single" w:sz="4" w:color="CCCCCC"/>
+              <w:bottom w:val="single" w:sz="4" w:color="CCCCCC"/>
+              <w:right w:val="single" w:sz="4" w:color="CCCCCC"/>
+            </w:tcBorders>
+          </w:tcPr>
+          <w:p>
+            <w:r>
+              <w:t>Hit@10</w:t>
+            </w:r>
+          </w:p>
+        </w:tc>
+        <w:tc>
+          <w:tcPr>
+            <w:tcW w:type="dxa" w:w="2351"/>
+            <w:tcBorders>
+              <w:top w:val="single" w:sz="4" w:color="CCCCCC"/>
+              <w:left w:val="single" w:sz="4" w:color="CCCCCC"/>
+              <w:bottom w:val="single" w:sz="4" w:color="CCCCCC"/>
+              <w:right w:val="single" w:sz="4" w:color="CCCCCC"/>
+            </w:tcBorders>
+          </w:tcPr>
+          <w:p>
+            <w:pPr>
+              <w:jc w:val="center"/>
+            </w:pPr>
+            <w:r>
+              <w:t>0.8000</w:t>
+            </w:r>
+          </w:p>
+        </w:tc>
+        <w:tc>
+          <w:tcPr>
+            <w:tcW w:type="dxa" w:w="2351"/>
+            <w:tcBorders>
+              <w:top w:val="single" w:sz="4" w:color="CCCCCC"/>
+              <w:left w:val="single" w:sz="4" w:color="CCCCCC"/>
+              <w:bottom w:val="single" w:sz="4" w:color="CCCCCC"/>
+              <w:right w:val="single" w:sz="4" w:color="CCCCCC"/>
+            </w:tcBorders>
+          </w:tcPr>
+          <w:p>
+            <w:pPr>
+              <w:jc w:val="center"/>
+            </w:pPr>
+            <w:r>
+              <w:t>0.6200</w:t>
+            </w:r>
+          </w:p>
+        </w:tc>
+        <w:tc>
+          <w:tcPr>
+            <w:tcW w:type="dxa" w:w="2351"/>
+            <w:shd w:val="clear" w:color="auto" w:fill="FFC7CE"/>
+            <w:tcBorders>
+              <w:top w:val="single" w:sz="4" w:color="CCCCCC"/>
+              <w:left w:val="single" w:sz="4" w:color="CCCCCC"/>
+              <w:bottom w:val="single" w:sz="4" w:color="CCCCCC"/>
+              <w:right w:val="single" w:sz="4" w:color="CCCCCC"/>
+            </w:tcBorders>
+          </w:tcPr>
+          <w:p>
+            <w:pPr>
+              <w:jc w:val="center"/>
+            </w:pPr>
+            <w:r>
+              <w:t>-0.1800</w:t>
+            </w:r>
+          </w:p>
+        </w:tc>
+      </w:tr>
+    </w:tbl>
+    <w:p/>
+    <w:p>
       <w:pPr>
         <w:pStyle w:val="Heading1"/>
         <w:jc w:val="left"/>

</xml_diff>

<commit_message>
feat(eval): add robustness evaluation results and update Word report
- Run robustness eval: 5 noise + 6 negative questions
- noise_robustness=0.80, negative_rejection=1.00
- Add section 5 robustness to Word report
</commit_message>
<xml_diff>
--- a/tests/evaluation/results/bao-cao-ket-qua-eval.docx
+++ b/tests/evaluation/results/bao-cao-ket-qua-eval.docx
@@ -6131,7 +6131,1102 @@
         <w:jc w:val="left"/>
       </w:pPr>
       <w:r>
-        <w:t>5. NHẬN XÉT VÀ ĐỀ XUẤT</w:t>
+        <w:t>5. ĐÁNH GIÁ ROBUSTNESS (11 CÂU)</w:t>
+      </w:r>
+    </w:p>
+    <w:p>
+      <w:r>
+        <w:rPr>
+          <w:i/>
+        </w:rPr>
+        <w:t>Tập robustness gồm 5 câu noise (nhiễu) + 6 câu negative (ngoài domain). Đánh giá thêm 2 metric: Noise Robustness và Negative Rejection.</w:t>
+      </w:r>
+    </w:p>
+    <w:p/>
+    <w:p>
+      <w:r>
+        <w:rPr>
+          <w:b/>
+        </w:rPr>
+        <w:t>5.1 Metric tổng thể:</w:t>
+      </w:r>
+    </w:p>
+    <w:tbl>
+      <w:tblPr>
+        <w:tblStyle w:val="TableGrid"/>
+        <w:tblW w:type="auto" w:w="0"/>
+        <w:tblLook w:firstColumn="1" w:firstRow="1" w:lastColumn="0" w:lastRow="0" w:noHBand="0" w:noVBand="1" w:val="04A0"/>
+      </w:tblPr>
+      <w:tblGrid>
+        <w:gridCol w:w="3135"/>
+        <w:gridCol w:w="3135"/>
+        <w:gridCol w:w="3135"/>
+      </w:tblGrid>
+      <w:tr>
+        <w:tc>
+          <w:tcPr>
+            <w:tcW w:type="dxa" w:w="3135"/>
+            <w:shd w:val="clear" w:color="auto" w:fill="7030A0"/>
+          </w:tcPr>
+          <w:p>
+            <w:r>
+              <w:rPr>
+                <w:b/>
+                <w:color w:val="FFFFFF"/>
+              </w:rPr>
+              <w:t>Metric</w:t>
+            </w:r>
+          </w:p>
+        </w:tc>
+        <w:tc>
+          <w:tcPr>
+            <w:tcW w:type="dxa" w:w="3135"/>
+            <w:shd w:val="clear" w:color="auto" w:fill="7030A0"/>
+          </w:tcPr>
+          <w:p>
+            <w:r>
+              <w:rPr>
+                <w:b/>
+                <w:color w:val="FFFFFF"/>
+              </w:rPr>
+              <w:t>Điểm</w:t>
+            </w:r>
+          </w:p>
+        </w:tc>
+        <w:tc>
+          <w:tcPr>
+            <w:tcW w:type="dxa" w:w="3135"/>
+            <w:shd w:val="clear" w:color="auto" w:fill="7030A0"/>
+          </w:tcPr>
+          <w:p>
+            <w:r>
+              <w:rPr>
+                <w:b/>
+                <w:color w:val="FFFFFF"/>
+              </w:rPr>
+              <w:t>Đánh giá</w:t>
+            </w:r>
+          </w:p>
+        </w:tc>
+      </w:tr>
+      <w:tr>
+        <w:tc>
+          <w:tcPr>
+            <w:tcW w:type="dxa" w:w="3135"/>
+            <w:shd w:val="clear" w:color="auto" w:fill="FFEB9C"/>
+            <w:tcBorders>
+              <w:top w:val="single" w:sz="4" w:color="CCCCCC"/>
+              <w:left w:val="single" w:sz="4" w:color="CCCCCC"/>
+              <w:bottom w:val="single" w:sz="4" w:color="CCCCCC"/>
+              <w:right w:val="single" w:sz="4" w:color="CCCCCC"/>
+            </w:tcBorders>
+          </w:tcPr>
+          <w:p>
+            <w:r>
+              <w:t>Độ trung thực (Faithfulness)</w:t>
+            </w:r>
+          </w:p>
+        </w:tc>
+        <w:tc>
+          <w:tcPr>
+            <w:tcW w:type="dxa" w:w="3135"/>
+            <w:shd w:val="clear" w:color="auto" w:fill="FFEB9C"/>
+            <w:tcBorders>
+              <w:top w:val="single" w:sz="4" w:color="CCCCCC"/>
+              <w:left w:val="single" w:sz="4" w:color="CCCCCC"/>
+              <w:bottom w:val="single" w:sz="4" w:color="CCCCCC"/>
+              <w:right w:val="single" w:sz="4" w:color="CCCCCC"/>
+            </w:tcBorders>
+          </w:tcPr>
+          <w:p>
+            <w:pPr>
+              <w:jc w:val="center"/>
+            </w:pPr>
+            <w:r>
+              <w:t>0.8000</w:t>
+            </w:r>
+          </w:p>
+        </w:tc>
+        <w:tc>
+          <w:tcPr>
+            <w:tcW w:type="dxa" w:w="3135"/>
+            <w:shd w:val="clear" w:color="auto" w:fill="FFEB9C"/>
+            <w:tcBorders>
+              <w:top w:val="single" w:sz="4" w:color="CCCCCC"/>
+              <w:left w:val="single" w:sz="4" w:color="CCCCCC"/>
+              <w:bottom w:val="single" w:sz="4" w:color="CCCCCC"/>
+              <w:right w:val="single" w:sz="4" w:color="CCCCCC"/>
+            </w:tcBorders>
+          </w:tcPr>
+          <w:p>
+            <w:pPr>
+              <w:jc w:val="center"/>
+            </w:pPr>
+            <w:r>
+              <w:t>Tốt</w:t>
+            </w:r>
+          </w:p>
+        </w:tc>
+      </w:tr>
+      <w:tr>
+        <w:tc>
+          <w:tcPr>
+            <w:tcW w:type="dxa" w:w="3135"/>
+            <w:shd w:val="clear" w:color="auto" w:fill="C6EFCE"/>
+            <w:tcBorders>
+              <w:top w:val="single" w:sz="4" w:color="CCCCCC"/>
+              <w:left w:val="single" w:sz="4" w:color="CCCCCC"/>
+              <w:bottom w:val="single" w:sz="4" w:color="CCCCCC"/>
+              <w:right w:val="single" w:sz="4" w:color="CCCCCC"/>
+            </w:tcBorders>
+          </w:tcPr>
+          <w:p>
+            <w:r>
+              <w:t>Độ liên quan câu trả lời (Answer Relevancy)</w:t>
+            </w:r>
+          </w:p>
+        </w:tc>
+        <w:tc>
+          <w:tcPr>
+            <w:tcW w:type="dxa" w:w="3135"/>
+            <w:shd w:val="clear" w:color="auto" w:fill="C6EFCE"/>
+            <w:tcBorders>
+              <w:top w:val="single" w:sz="4" w:color="CCCCCC"/>
+              <w:left w:val="single" w:sz="4" w:color="CCCCCC"/>
+              <w:bottom w:val="single" w:sz="4" w:color="CCCCCC"/>
+              <w:right w:val="single" w:sz="4" w:color="CCCCCC"/>
+            </w:tcBorders>
+          </w:tcPr>
+          <w:p>
+            <w:pPr>
+              <w:jc w:val="center"/>
+            </w:pPr>
+            <w:r>
+              <w:t>1.0000</w:t>
+            </w:r>
+          </w:p>
+        </w:tc>
+        <w:tc>
+          <w:tcPr>
+            <w:tcW w:type="dxa" w:w="3135"/>
+            <w:shd w:val="clear" w:color="auto" w:fill="C6EFCE"/>
+            <w:tcBorders>
+              <w:top w:val="single" w:sz="4" w:color="CCCCCC"/>
+              <w:left w:val="single" w:sz="4" w:color="CCCCCC"/>
+              <w:bottom w:val="single" w:sz="4" w:color="CCCCCC"/>
+              <w:right w:val="single" w:sz="4" w:color="CCCCCC"/>
+            </w:tcBorders>
+          </w:tcPr>
+          <w:p>
+            <w:pPr>
+              <w:jc w:val="center"/>
+            </w:pPr>
+            <w:r>
+              <w:t>Tốt</w:t>
+            </w:r>
+          </w:p>
+        </w:tc>
+      </w:tr>
+      <w:tr>
+        <w:tc>
+          <w:tcPr>
+            <w:tcW w:type="dxa" w:w="3135"/>
+            <w:shd w:val="clear" w:color="auto" w:fill="C6EFCE"/>
+            <w:tcBorders>
+              <w:top w:val="single" w:sz="4" w:color="CCCCCC"/>
+              <w:left w:val="single" w:sz="4" w:color="CCCCCC"/>
+              <w:bottom w:val="single" w:sz="4" w:color="CCCCCC"/>
+              <w:right w:val="single" w:sz="4" w:color="CCCCCC"/>
+            </w:tcBorders>
+          </w:tcPr>
+          <w:p>
+            <w:r>
+              <w:t>Độ chính xác ngữ cảnh (Context Precision)</w:t>
+            </w:r>
+          </w:p>
+        </w:tc>
+        <w:tc>
+          <w:tcPr>
+            <w:tcW w:type="dxa" w:w="3135"/>
+            <w:shd w:val="clear" w:color="auto" w:fill="C6EFCE"/>
+            <w:tcBorders>
+              <w:top w:val="single" w:sz="4" w:color="CCCCCC"/>
+              <w:left w:val="single" w:sz="4" w:color="CCCCCC"/>
+              <w:bottom w:val="single" w:sz="4" w:color="CCCCCC"/>
+              <w:right w:val="single" w:sz="4" w:color="CCCCCC"/>
+            </w:tcBorders>
+          </w:tcPr>
+          <w:p>
+            <w:pPr>
+              <w:jc w:val="center"/>
+            </w:pPr>
+            <w:r>
+              <w:t>1.0000</w:t>
+            </w:r>
+          </w:p>
+        </w:tc>
+        <w:tc>
+          <w:tcPr>
+            <w:tcW w:type="dxa" w:w="3135"/>
+            <w:shd w:val="clear" w:color="auto" w:fill="C6EFCE"/>
+            <w:tcBorders>
+              <w:top w:val="single" w:sz="4" w:color="CCCCCC"/>
+              <w:left w:val="single" w:sz="4" w:color="CCCCCC"/>
+              <w:bottom w:val="single" w:sz="4" w:color="CCCCCC"/>
+              <w:right w:val="single" w:sz="4" w:color="CCCCCC"/>
+            </w:tcBorders>
+          </w:tcPr>
+          <w:p>
+            <w:pPr>
+              <w:jc w:val="center"/>
+            </w:pPr>
+            <w:r>
+              <w:t>Tốt</w:t>
+            </w:r>
+          </w:p>
+        </w:tc>
+      </w:tr>
+      <w:tr>
+        <w:tc>
+          <w:tcPr>
+            <w:tcW w:type="dxa" w:w="3135"/>
+            <w:shd w:val="clear" w:color="auto" w:fill="C6EFCE"/>
+            <w:tcBorders>
+              <w:top w:val="single" w:sz="4" w:color="CCCCCC"/>
+              <w:left w:val="single" w:sz="4" w:color="CCCCCC"/>
+              <w:bottom w:val="single" w:sz="4" w:color="CCCCCC"/>
+              <w:right w:val="single" w:sz="4" w:color="CCCCCC"/>
+            </w:tcBorders>
+          </w:tcPr>
+          <w:p>
+            <w:r>
+              <w:t>Độ bao phủ ngữ cảnh (Context Recall)</w:t>
+            </w:r>
+          </w:p>
+        </w:tc>
+        <w:tc>
+          <w:tcPr>
+            <w:tcW w:type="dxa" w:w="3135"/>
+            <w:shd w:val="clear" w:color="auto" w:fill="C6EFCE"/>
+            <w:tcBorders>
+              <w:top w:val="single" w:sz="4" w:color="CCCCCC"/>
+              <w:left w:val="single" w:sz="4" w:color="CCCCCC"/>
+              <w:bottom w:val="single" w:sz="4" w:color="CCCCCC"/>
+              <w:right w:val="single" w:sz="4" w:color="CCCCCC"/>
+            </w:tcBorders>
+          </w:tcPr>
+          <w:p>
+            <w:pPr>
+              <w:jc w:val="center"/>
+            </w:pPr>
+            <w:r>
+              <w:t>1.0000</w:t>
+            </w:r>
+          </w:p>
+        </w:tc>
+        <w:tc>
+          <w:tcPr>
+            <w:tcW w:type="dxa" w:w="3135"/>
+            <w:shd w:val="clear" w:color="auto" w:fill="C6EFCE"/>
+            <w:tcBorders>
+              <w:top w:val="single" w:sz="4" w:color="CCCCCC"/>
+              <w:left w:val="single" w:sz="4" w:color="CCCCCC"/>
+              <w:bottom w:val="single" w:sz="4" w:color="CCCCCC"/>
+              <w:right w:val="single" w:sz="4" w:color="CCCCCC"/>
+            </w:tcBorders>
+          </w:tcPr>
+          <w:p>
+            <w:pPr>
+              <w:jc w:val="center"/>
+            </w:pPr>
+            <w:r>
+              <w:t>Tốt</w:t>
+            </w:r>
+          </w:p>
+        </w:tc>
+      </w:tr>
+      <w:tr>
+        <w:tc>
+          <w:tcPr>
+            <w:tcW w:type="dxa" w:w="3135"/>
+            <w:shd w:val="clear" w:color="auto" w:fill="FFC7CE"/>
+            <w:tcBorders>
+              <w:top w:val="single" w:sz="4" w:color="CCCCCC"/>
+              <w:left w:val="single" w:sz="4" w:color="CCCCCC"/>
+              <w:bottom w:val="single" w:sz="4" w:color="CCCCCC"/>
+              <w:right w:val="single" w:sz="4" w:color="CCCCCC"/>
+            </w:tcBorders>
+          </w:tcPr>
+          <w:p>
+            <w:r>
+              <w:t>Độ đúng đắn (Correctness)</w:t>
+            </w:r>
+          </w:p>
+        </w:tc>
+        <w:tc>
+          <w:tcPr>
+            <w:tcW w:type="dxa" w:w="3135"/>
+            <w:shd w:val="clear" w:color="auto" w:fill="FFC7CE"/>
+            <w:tcBorders>
+              <w:top w:val="single" w:sz="4" w:color="CCCCCC"/>
+              <w:left w:val="single" w:sz="4" w:color="CCCCCC"/>
+              <w:bottom w:val="single" w:sz="4" w:color="CCCCCC"/>
+              <w:right w:val="single" w:sz="4" w:color="CCCCCC"/>
+            </w:tcBorders>
+          </w:tcPr>
+          <w:p>
+            <w:pPr>
+              <w:jc w:val="center"/>
+            </w:pPr>
+            <w:r>
+              <w:t>0.5000</w:t>
+            </w:r>
+          </w:p>
+        </w:tc>
+        <w:tc>
+          <w:tcPr>
+            <w:tcW w:type="dxa" w:w="3135"/>
+            <w:shd w:val="clear" w:color="auto" w:fill="FFC7CE"/>
+            <w:tcBorders>
+              <w:top w:val="single" w:sz="4" w:color="CCCCCC"/>
+              <w:left w:val="single" w:sz="4" w:color="CCCCCC"/>
+              <w:bottom w:val="single" w:sz="4" w:color="CCCCCC"/>
+              <w:right w:val="single" w:sz="4" w:color="CCCCCC"/>
+            </w:tcBorders>
+          </w:tcPr>
+          <w:p>
+            <w:pPr>
+              <w:jc w:val="center"/>
+            </w:pPr>
+            <w:r>
+              <w:t>Cần cải thiện</w:t>
+            </w:r>
+          </w:p>
+        </w:tc>
+      </w:tr>
+      <w:tr>
+        <w:tc>
+          <w:tcPr>
+            <w:tcW w:type="dxa" w:w="3135"/>
+            <w:shd w:val="clear" w:color="auto" w:fill="FFEB9C"/>
+            <w:tcBorders>
+              <w:top w:val="single" w:sz="4" w:color="CCCCCC"/>
+              <w:left w:val="single" w:sz="4" w:color="CCCCCC"/>
+              <w:bottom w:val="single" w:sz="4" w:color="CCCCCC"/>
+              <w:right w:val="single" w:sz="4" w:color="CCCCCC"/>
+            </w:tcBorders>
+          </w:tcPr>
+          <w:p>
+            <w:r>
+              <w:t>Độ bền với nhiễu (Noise Robustness)</w:t>
+            </w:r>
+          </w:p>
+        </w:tc>
+        <w:tc>
+          <w:tcPr>
+            <w:tcW w:type="dxa" w:w="3135"/>
+            <w:shd w:val="clear" w:color="auto" w:fill="FFEB9C"/>
+            <w:tcBorders>
+              <w:top w:val="single" w:sz="4" w:color="CCCCCC"/>
+              <w:left w:val="single" w:sz="4" w:color="CCCCCC"/>
+              <w:bottom w:val="single" w:sz="4" w:color="CCCCCC"/>
+              <w:right w:val="single" w:sz="4" w:color="CCCCCC"/>
+            </w:tcBorders>
+          </w:tcPr>
+          <w:p>
+            <w:pPr>
+              <w:jc w:val="center"/>
+            </w:pPr>
+            <w:r>
+              <w:t>0.8000</w:t>
+            </w:r>
+          </w:p>
+        </w:tc>
+        <w:tc>
+          <w:tcPr>
+            <w:tcW w:type="dxa" w:w="3135"/>
+            <w:shd w:val="clear" w:color="auto" w:fill="FFEB9C"/>
+            <w:tcBorders>
+              <w:top w:val="single" w:sz="4" w:color="CCCCCC"/>
+              <w:left w:val="single" w:sz="4" w:color="CCCCCC"/>
+              <w:bottom w:val="single" w:sz="4" w:color="CCCCCC"/>
+              <w:right w:val="single" w:sz="4" w:color="CCCCCC"/>
+            </w:tcBorders>
+          </w:tcPr>
+          <w:p>
+            <w:pPr>
+              <w:jc w:val="center"/>
+            </w:pPr>
+            <w:r>
+              <w:t>Tốt</w:t>
+            </w:r>
+          </w:p>
+        </w:tc>
+      </w:tr>
+      <w:tr>
+        <w:tc>
+          <w:tcPr>
+            <w:tcW w:type="dxa" w:w="3135"/>
+            <w:shd w:val="clear" w:color="auto" w:fill="C6EFCE"/>
+            <w:tcBorders>
+              <w:top w:val="single" w:sz="4" w:color="CCCCCC"/>
+              <w:left w:val="single" w:sz="4" w:color="CCCCCC"/>
+              <w:bottom w:val="single" w:sz="4" w:color="CCCCCC"/>
+              <w:right w:val="single" w:sz="4" w:color="CCCCCC"/>
+            </w:tcBorders>
+          </w:tcPr>
+          <w:p>
+            <w:r>
+              <w:t>Từ chối câu ngoài domain (Negative Rejection)</w:t>
+            </w:r>
+          </w:p>
+        </w:tc>
+        <w:tc>
+          <w:tcPr>
+            <w:tcW w:type="dxa" w:w="3135"/>
+            <w:shd w:val="clear" w:color="auto" w:fill="C6EFCE"/>
+            <w:tcBorders>
+              <w:top w:val="single" w:sz="4" w:color="CCCCCC"/>
+              <w:left w:val="single" w:sz="4" w:color="CCCCCC"/>
+              <w:bottom w:val="single" w:sz="4" w:color="CCCCCC"/>
+              <w:right w:val="single" w:sz="4" w:color="CCCCCC"/>
+            </w:tcBorders>
+          </w:tcPr>
+          <w:p>
+            <w:pPr>
+              <w:jc w:val="center"/>
+            </w:pPr>
+            <w:r>
+              <w:t>1.0000</w:t>
+            </w:r>
+          </w:p>
+        </w:tc>
+        <w:tc>
+          <w:tcPr>
+            <w:tcW w:type="dxa" w:w="3135"/>
+            <w:shd w:val="clear" w:color="auto" w:fill="C6EFCE"/>
+            <w:tcBorders>
+              <w:top w:val="single" w:sz="4" w:color="CCCCCC"/>
+              <w:left w:val="single" w:sz="4" w:color="CCCCCC"/>
+              <w:bottom w:val="single" w:sz="4" w:color="CCCCCC"/>
+              <w:right w:val="single" w:sz="4" w:color="CCCCCC"/>
+            </w:tcBorders>
+          </w:tcPr>
+          <w:p>
+            <w:pPr>
+              <w:jc w:val="center"/>
+            </w:pPr>
+            <w:r>
+              <w:t>Tốt</w:t>
+            </w:r>
+          </w:p>
+        </w:tc>
+      </w:tr>
+    </w:tbl>
+    <w:p/>
+    <w:p>
+      <w:r>
+        <w:rPr>
+          <w:b/>
+        </w:rPr>
+        <w:t>5.2 Retrieval Rank Metrics (Robustness):</w:t>
+      </w:r>
+    </w:p>
+    <w:tbl>
+      <w:tblPr>
+        <w:tblStyle w:val="TableGrid"/>
+        <w:tblW w:type="auto" w:w="0"/>
+        <w:tblLook w:firstColumn="1" w:firstRow="1" w:lastColumn="0" w:lastRow="0" w:noHBand="0" w:noVBand="1" w:val="04A0"/>
+      </w:tblPr>
+      <w:tblGrid>
+        <w:gridCol w:w="3135"/>
+        <w:gridCol w:w="3135"/>
+        <w:gridCol w:w="3135"/>
+      </w:tblGrid>
+      <w:tr>
+        <w:tc>
+          <w:tcPr>
+            <w:tcW w:type="dxa" w:w="3135"/>
+            <w:shd w:val="clear" w:color="auto" w:fill="375623"/>
+          </w:tcPr>
+          <w:p>
+            <w:r>
+              <w:rPr>
+                <w:b/>
+                <w:color w:val="FFFFFF"/>
+              </w:rPr>
+              <w:t>Metric</w:t>
+            </w:r>
+          </w:p>
+        </w:tc>
+        <w:tc>
+          <w:tcPr>
+            <w:tcW w:type="dxa" w:w="3135"/>
+            <w:shd w:val="clear" w:color="auto" w:fill="375623"/>
+          </w:tcPr>
+          <w:p>
+            <w:r>
+              <w:rPr>
+                <w:b/>
+                <w:color w:val="FFFFFF"/>
+              </w:rPr>
+              <w:t>Điểm</w:t>
+            </w:r>
+          </w:p>
+        </w:tc>
+        <w:tc>
+          <w:tcPr>
+            <w:tcW w:type="dxa" w:w="3135"/>
+            <w:shd w:val="clear" w:color="auto" w:fill="375623"/>
+          </w:tcPr>
+          <w:p>
+            <w:r>
+              <w:rPr>
+                <w:b/>
+                <w:color w:val="FFFFFF"/>
+              </w:rPr>
+              <w:t>Đánh giá</w:t>
+            </w:r>
+          </w:p>
+        </w:tc>
+      </w:tr>
+      <w:tr>
+        <w:tc>
+          <w:tcPr>
+            <w:tcW w:type="dxa" w:w="3135"/>
+            <w:shd w:val="clear" w:color="auto" w:fill="FFC7CE"/>
+            <w:tcBorders>
+              <w:top w:val="single" w:sz="4" w:color="CCCCCC"/>
+              <w:left w:val="single" w:sz="4" w:color="CCCCCC"/>
+              <w:bottom w:val="single" w:sz="4" w:color="CCCCCC"/>
+              <w:right w:val="single" w:sz="4" w:color="CCCCCC"/>
+            </w:tcBorders>
+          </w:tcPr>
+          <w:p>
+            <w:r>
+              <w:t>MAP@10</w:t>
+            </w:r>
+          </w:p>
+        </w:tc>
+        <w:tc>
+          <w:tcPr>
+            <w:tcW w:type="dxa" w:w="3135"/>
+            <w:shd w:val="clear" w:color="auto" w:fill="FFC7CE"/>
+            <w:tcBorders>
+              <w:top w:val="single" w:sz="4" w:color="CCCCCC"/>
+              <w:left w:val="single" w:sz="4" w:color="CCCCCC"/>
+              <w:bottom w:val="single" w:sz="4" w:color="CCCCCC"/>
+              <w:right w:val="single" w:sz="4" w:color="CCCCCC"/>
+            </w:tcBorders>
+          </w:tcPr>
+          <w:p>
+            <w:pPr>
+              <w:jc w:val="center"/>
+            </w:pPr>
+            <w:r>
+              <w:t>0.3220</w:t>
+            </w:r>
+          </w:p>
+        </w:tc>
+        <w:tc>
+          <w:tcPr>
+            <w:tcW w:type="dxa" w:w="3135"/>
+            <w:shd w:val="clear" w:color="auto" w:fill="FFC7CE"/>
+            <w:tcBorders>
+              <w:top w:val="single" w:sz="4" w:color="CCCCCC"/>
+              <w:left w:val="single" w:sz="4" w:color="CCCCCC"/>
+              <w:bottom w:val="single" w:sz="4" w:color="CCCCCC"/>
+              <w:right w:val="single" w:sz="4" w:color="CCCCCC"/>
+            </w:tcBorders>
+          </w:tcPr>
+          <w:p>
+            <w:pPr>
+              <w:jc w:val="center"/>
+            </w:pPr>
+            <w:r>
+              <w:t>Cần cải thiện</w:t>
+            </w:r>
+          </w:p>
+        </w:tc>
+      </w:tr>
+      <w:tr>
+        <w:tc>
+          <w:tcPr>
+            <w:tcW w:type="dxa" w:w="3135"/>
+            <w:shd w:val="clear" w:color="auto" w:fill="FFC7CE"/>
+            <w:tcBorders>
+              <w:top w:val="single" w:sz="4" w:color="CCCCCC"/>
+              <w:left w:val="single" w:sz="4" w:color="CCCCCC"/>
+              <w:bottom w:val="single" w:sz="4" w:color="CCCCCC"/>
+              <w:right w:val="single" w:sz="4" w:color="CCCCCC"/>
+            </w:tcBorders>
+          </w:tcPr>
+          <w:p>
+            <w:r>
+              <w:t>MRR</w:t>
+            </w:r>
+          </w:p>
+        </w:tc>
+        <w:tc>
+          <w:tcPr>
+            <w:tcW w:type="dxa" w:w="3135"/>
+            <w:shd w:val="clear" w:color="auto" w:fill="FFC7CE"/>
+            <w:tcBorders>
+              <w:top w:val="single" w:sz="4" w:color="CCCCCC"/>
+              <w:left w:val="single" w:sz="4" w:color="CCCCCC"/>
+              <w:bottom w:val="single" w:sz="4" w:color="CCCCCC"/>
+              <w:right w:val="single" w:sz="4" w:color="CCCCCC"/>
+            </w:tcBorders>
+          </w:tcPr>
+          <w:p>
+            <w:pPr>
+              <w:jc w:val="center"/>
+            </w:pPr>
+            <w:r>
+              <w:t>0.3182</w:t>
+            </w:r>
+          </w:p>
+        </w:tc>
+        <w:tc>
+          <w:tcPr>
+            <w:tcW w:type="dxa" w:w="3135"/>
+            <w:shd w:val="clear" w:color="auto" w:fill="FFC7CE"/>
+            <w:tcBorders>
+              <w:top w:val="single" w:sz="4" w:color="CCCCCC"/>
+              <w:left w:val="single" w:sz="4" w:color="CCCCCC"/>
+              <w:bottom w:val="single" w:sz="4" w:color="CCCCCC"/>
+              <w:right w:val="single" w:sz="4" w:color="CCCCCC"/>
+            </w:tcBorders>
+          </w:tcPr>
+          <w:p>
+            <w:pPr>
+              <w:jc w:val="center"/>
+            </w:pPr>
+            <w:r>
+              <w:t>Cần cải thiện</w:t>
+            </w:r>
+          </w:p>
+        </w:tc>
+      </w:tr>
+      <w:tr>
+        <w:tc>
+          <w:tcPr>
+            <w:tcW w:type="dxa" w:w="3135"/>
+            <w:shd w:val="clear" w:color="auto" w:fill="FFC7CE"/>
+            <w:tcBorders>
+              <w:top w:val="single" w:sz="4" w:color="CCCCCC"/>
+              <w:left w:val="single" w:sz="4" w:color="CCCCCC"/>
+              <w:bottom w:val="single" w:sz="4" w:color="CCCCCC"/>
+              <w:right w:val="single" w:sz="4" w:color="CCCCCC"/>
+            </w:tcBorders>
+          </w:tcPr>
+          <w:p>
+            <w:r>
+              <w:t>Hit@10</w:t>
+            </w:r>
+          </w:p>
+        </w:tc>
+        <w:tc>
+          <w:tcPr>
+            <w:tcW w:type="dxa" w:w="3135"/>
+            <w:shd w:val="clear" w:color="auto" w:fill="FFC7CE"/>
+            <w:tcBorders>
+              <w:top w:val="single" w:sz="4" w:color="CCCCCC"/>
+              <w:left w:val="single" w:sz="4" w:color="CCCCCC"/>
+              <w:bottom w:val="single" w:sz="4" w:color="CCCCCC"/>
+              <w:right w:val="single" w:sz="4" w:color="CCCCCC"/>
+            </w:tcBorders>
+          </w:tcPr>
+          <w:p>
+            <w:pPr>
+              <w:jc w:val="center"/>
+            </w:pPr>
+            <w:r>
+              <w:t>0.3636</w:t>
+            </w:r>
+          </w:p>
+        </w:tc>
+        <w:tc>
+          <w:tcPr>
+            <w:tcW w:type="dxa" w:w="3135"/>
+            <w:shd w:val="clear" w:color="auto" w:fill="FFC7CE"/>
+            <w:tcBorders>
+              <w:top w:val="single" w:sz="4" w:color="CCCCCC"/>
+              <w:left w:val="single" w:sz="4" w:color="CCCCCC"/>
+              <w:bottom w:val="single" w:sz="4" w:color="CCCCCC"/>
+              <w:right w:val="single" w:sz="4" w:color="CCCCCC"/>
+            </w:tcBorders>
+          </w:tcPr>
+          <w:p>
+            <w:pPr>
+              <w:jc w:val="center"/>
+            </w:pPr>
+            <w:r>
+              <w:t>Cần cải thiện</w:t>
+            </w:r>
+          </w:p>
+        </w:tc>
+      </w:tr>
+    </w:tbl>
+    <w:p/>
+    <w:p>
+      <w:r>
+        <w:rPr>
+          <w:b/>
+        </w:rPr>
+        <w:t>Retrieval Rank Metrics theo danh mục (k=10):</w:t>
+      </w:r>
+    </w:p>
+    <w:tbl>
+      <w:tblPr>
+        <w:tblStyle w:val="TableGrid"/>
+        <w:tblW w:type="auto" w:w="0"/>
+        <w:tblLook w:firstColumn="1" w:firstRow="1" w:lastColumn="0" w:lastRow="0" w:noHBand="0" w:noVBand="1" w:val="04A0"/>
+      </w:tblPr>
+      <w:tblGrid>
+        <w:gridCol w:w="2351"/>
+        <w:gridCol w:w="2351"/>
+        <w:gridCol w:w="2351"/>
+        <w:gridCol w:w="2351"/>
+      </w:tblGrid>
+      <w:tr>
+        <w:tc>
+          <w:tcPr>
+            <w:tcW w:type="dxa" w:w="2351"/>
+            <w:shd w:val="clear" w:color="auto" w:fill="375623"/>
+          </w:tcPr>
+          <w:p>
+            <w:r>
+              <w:rPr>
+                <w:b/>
+                <w:color w:val="FFFFFF"/>
+              </w:rPr>
+              <w:t>Danh mục</w:t>
+            </w:r>
+          </w:p>
+        </w:tc>
+        <w:tc>
+          <w:tcPr>
+            <w:tcW w:type="dxa" w:w="2351"/>
+            <w:shd w:val="clear" w:color="auto" w:fill="375623"/>
+          </w:tcPr>
+          <w:p>
+            <w:r>
+              <w:rPr>
+                <w:b/>
+                <w:color w:val="FFFFFF"/>
+              </w:rPr>
+              <w:t>MAP@10</w:t>
+            </w:r>
+          </w:p>
+        </w:tc>
+        <w:tc>
+          <w:tcPr>
+            <w:tcW w:type="dxa" w:w="2351"/>
+            <w:shd w:val="clear" w:color="auto" w:fill="375623"/>
+          </w:tcPr>
+          <w:p>
+            <w:r>
+              <w:rPr>
+                <w:b/>
+                <w:color w:val="FFFFFF"/>
+              </w:rPr>
+              <w:t>MRR</w:t>
+            </w:r>
+          </w:p>
+        </w:tc>
+        <w:tc>
+          <w:tcPr>
+            <w:tcW w:type="dxa" w:w="2351"/>
+            <w:shd w:val="clear" w:color="auto" w:fill="375623"/>
+          </w:tcPr>
+          <w:p>
+            <w:r>
+              <w:rPr>
+                <w:b/>
+                <w:color w:val="FFFFFF"/>
+              </w:rPr>
+              <w:t>Hit@10</w:t>
+            </w:r>
+          </w:p>
+        </w:tc>
+      </w:tr>
+      <w:tr>
+        <w:tc>
+          <w:tcPr>
+            <w:tcW w:type="dxa" w:w="2351"/>
+            <w:tcBorders>
+              <w:top w:val="single" w:sz="4" w:color="CCCCCC"/>
+              <w:left w:val="single" w:sz="4" w:color="CCCCCC"/>
+              <w:bottom w:val="single" w:sz="4" w:color="CCCCCC"/>
+              <w:right w:val="single" w:sz="4" w:color="CCCCCC"/>
+            </w:tcBorders>
+          </w:tcPr>
+          <w:p>
+            <w:r>
+              <w:t>Học vụ</w:t>
+            </w:r>
+          </w:p>
+        </w:tc>
+        <w:tc>
+          <w:tcPr>
+            <w:tcW w:type="dxa" w:w="2351"/>
+            <w:shd w:val="clear" w:color="auto" w:fill="FFC7CE"/>
+            <w:tcBorders>
+              <w:top w:val="single" w:sz="4" w:color="CCCCCC"/>
+              <w:left w:val="single" w:sz="4" w:color="CCCCCC"/>
+              <w:bottom w:val="single" w:sz="4" w:color="CCCCCC"/>
+              <w:right w:val="single" w:sz="4" w:color="CCCCCC"/>
+            </w:tcBorders>
+          </w:tcPr>
+          <w:p>
+            <w:pPr>
+              <w:jc w:val="center"/>
+            </w:pPr>
+            <w:r>
+              <w:t>0.0000</w:t>
+            </w:r>
+          </w:p>
+        </w:tc>
+        <w:tc>
+          <w:tcPr>
+            <w:tcW w:type="dxa" w:w="2351"/>
+            <w:shd w:val="clear" w:color="auto" w:fill="FFC7CE"/>
+            <w:tcBorders>
+              <w:top w:val="single" w:sz="4" w:color="CCCCCC"/>
+              <w:left w:val="single" w:sz="4" w:color="CCCCCC"/>
+              <w:bottom w:val="single" w:sz="4" w:color="CCCCCC"/>
+              <w:right w:val="single" w:sz="4" w:color="CCCCCC"/>
+            </w:tcBorders>
+          </w:tcPr>
+          <w:p>
+            <w:pPr>
+              <w:jc w:val="center"/>
+            </w:pPr>
+            <w:r>
+              <w:t>0.0000</w:t>
+            </w:r>
+          </w:p>
+        </w:tc>
+        <w:tc>
+          <w:tcPr>
+            <w:tcW w:type="dxa" w:w="2351"/>
+            <w:shd w:val="clear" w:color="auto" w:fill="FFC7CE"/>
+            <w:tcBorders>
+              <w:top w:val="single" w:sz="4" w:color="CCCCCC"/>
+              <w:left w:val="single" w:sz="4" w:color="CCCCCC"/>
+              <w:bottom w:val="single" w:sz="4" w:color="CCCCCC"/>
+              <w:right w:val="single" w:sz="4" w:color="CCCCCC"/>
+            </w:tcBorders>
+          </w:tcPr>
+          <w:p>
+            <w:pPr>
+              <w:jc w:val="center"/>
+            </w:pPr>
+            <w:r>
+              <w:t>0.0000</w:t>
+            </w:r>
+          </w:p>
+        </w:tc>
+      </w:tr>
+      <w:tr>
+        <w:tc>
+          <w:tcPr>
+            <w:tcW w:type="dxa" w:w="2351"/>
+            <w:tcBorders>
+              <w:top w:val="single" w:sz="4" w:color="CCCCCC"/>
+              <w:left w:val="single" w:sz="4" w:color="CCCCCC"/>
+              <w:bottom w:val="single" w:sz="4" w:color="CCCCCC"/>
+              <w:right w:val="single" w:sz="4" w:color="CCCCCC"/>
+            </w:tcBorders>
+          </w:tcPr>
+          <w:p>
+            <w:r>
+              <w:t>out_of_domain</w:t>
+            </w:r>
+          </w:p>
+        </w:tc>
+        <w:tc>
+          <w:tcPr>
+            <w:tcW w:type="dxa" w:w="2351"/>
+            <w:shd w:val="clear" w:color="auto" w:fill="FFC7CE"/>
+            <w:tcBorders>
+              <w:top w:val="single" w:sz="4" w:color="CCCCCC"/>
+              <w:left w:val="single" w:sz="4" w:color="CCCCCC"/>
+              <w:bottom w:val="single" w:sz="4" w:color="CCCCCC"/>
+              <w:right w:val="single" w:sz="4" w:color="CCCCCC"/>
+            </w:tcBorders>
+          </w:tcPr>
+          <w:p>
+            <w:pPr>
+              <w:jc w:val="center"/>
+            </w:pPr>
+            <w:r>
+              <w:t>0.0000</w:t>
+            </w:r>
+          </w:p>
+        </w:tc>
+        <w:tc>
+          <w:tcPr>
+            <w:tcW w:type="dxa" w:w="2351"/>
+            <w:shd w:val="clear" w:color="auto" w:fill="FFC7CE"/>
+            <w:tcBorders>
+              <w:top w:val="single" w:sz="4" w:color="CCCCCC"/>
+              <w:left w:val="single" w:sz="4" w:color="CCCCCC"/>
+              <w:bottom w:val="single" w:sz="4" w:color="CCCCCC"/>
+              <w:right w:val="single" w:sz="4" w:color="CCCCCC"/>
+            </w:tcBorders>
+          </w:tcPr>
+          <w:p>
+            <w:pPr>
+              <w:jc w:val="center"/>
+            </w:pPr>
+            <w:r>
+              <w:t>0.0000</w:t>
+            </w:r>
+          </w:p>
+        </w:tc>
+        <w:tc>
+          <w:tcPr>
+            <w:tcW w:type="dxa" w:w="2351"/>
+            <w:shd w:val="clear" w:color="auto" w:fill="FFC7CE"/>
+            <w:tcBorders>
+              <w:top w:val="single" w:sz="4" w:color="CCCCCC"/>
+              <w:left w:val="single" w:sz="4" w:color="CCCCCC"/>
+              <w:bottom w:val="single" w:sz="4" w:color="CCCCCC"/>
+              <w:right w:val="single" w:sz="4" w:color="CCCCCC"/>
+            </w:tcBorders>
+          </w:tcPr>
+          <w:p>
+            <w:pPr>
+              <w:jc w:val="center"/>
+            </w:pPr>
+            <w:r>
+              <w:t>0.0000</w:t>
+            </w:r>
+          </w:p>
+        </w:tc>
+      </w:tr>
+      <w:tr>
+        <w:tc>
+          <w:tcPr>
+            <w:tcW w:type="dxa" w:w="2351"/>
+            <w:tcBorders>
+              <w:top w:val="single" w:sz="4" w:color="CCCCCC"/>
+              <w:left w:val="single" w:sz="4" w:color="CCCCCC"/>
+              <w:bottom w:val="single" w:sz="4" w:color="CCCCCC"/>
+              <w:right w:val="single" w:sz="4" w:color="CCCCCC"/>
+            </w:tcBorders>
+          </w:tcPr>
+          <w:p>
+            <w:r>
+              <w:t>Tuyển sinh</w:t>
+            </w:r>
+          </w:p>
+        </w:tc>
+        <w:tc>
+          <w:tcPr>
+            <w:tcW w:type="dxa" w:w="2351"/>
+            <w:shd w:val="clear" w:color="auto" w:fill="C6EFCE"/>
+            <w:tcBorders>
+              <w:top w:val="single" w:sz="4" w:color="CCCCCC"/>
+              <w:left w:val="single" w:sz="4" w:color="CCCCCC"/>
+              <w:bottom w:val="single" w:sz="4" w:color="CCCCCC"/>
+              <w:right w:val="single" w:sz="4" w:color="CCCCCC"/>
+            </w:tcBorders>
+          </w:tcPr>
+          <w:p>
+            <w:pPr>
+              <w:jc w:val="center"/>
+            </w:pPr>
+            <w:r>
+              <w:t>0.8854</w:t>
+            </w:r>
+          </w:p>
+        </w:tc>
+        <w:tc>
+          <w:tcPr>
+            <w:tcW w:type="dxa" w:w="2351"/>
+            <w:shd w:val="clear" w:color="auto" w:fill="C6EFCE"/>
+            <w:tcBorders>
+              <w:top w:val="single" w:sz="4" w:color="CCCCCC"/>
+              <w:left w:val="single" w:sz="4" w:color="CCCCCC"/>
+              <w:bottom w:val="single" w:sz="4" w:color="CCCCCC"/>
+              <w:right w:val="single" w:sz="4" w:color="CCCCCC"/>
+            </w:tcBorders>
+          </w:tcPr>
+          <w:p>
+            <w:pPr>
+              <w:jc w:val="center"/>
+            </w:pPr>
+            <w:r>
+              <w:t>0.8750</w:t>
+            </w:r>
+          </w:p>
+        </w:tc>
+        <w:tc>
+          <w:tcPr>
+            <w:tcW w:type="dxa" w:w="2351"/>
+            <w:shd w:val="clear" w:color="auto" w:fill="C6EFCE"/>
+            <w:tcBorders>
+              <w:top w:val="single" w:sz="4" w:color="CCCCCC"/>
+              <w:left w:val="single" w:sz="4" w:color="CCCCCC"/>
+              <w:bottom w:val="single" w:sz="4" w:color="CCCCCC"/>
+              <w:right w:val="single" w:sz="4" w:color="CCCCCC"/>
+            </w:tcBorders>
+          </w:tcPr>
+          <w:p>
+            <w:pPr>
+              <w:jc w:val="center"/>
+            </w:pPr>
+            <w:r>
+              <w:t>1.0000</w:t>
+            </w:r>
+          </w:p>
+        </w:tc>
+      </w:tr>
+    </w:tbl>
+    <w:p/>
+    <w:p>
+      <w:r>
+        <w:rPr>
+          <w:b/>
+        </w:rPr>
+        <w:t>5.3 Nhận xét:</w:t>
+      </w:r>
+    </w:p>
+    <w:p>
+      <w:pPr>
+        <w:pStyle w:val="ListBullet"/>
+      </w:pPr>
+      <w:r>
+        <w:t>Negative Rejection = 1.0 — hệ thống từ chối 100% câu hỏi ngoài domain (nấu phở, thời tiết, giá vàng...).</w:t>
+      </w:r>
+    </w:p>
+    <w:p>
+      <w:pPr>
+        <w:pStyle w:val="ListBullet"/>
+      </w:pPr>
+      <w:r>
+        <w:t>Noise Robustness = 0.8 — xử lý tốt câu hỏi nhiễu, chỉ 1/5 câu bị ảnh hưởng.</w:t>
+      </w:r>
+    </w:p>
+    <w:p>
+      <w:pPr>
+        <w:pStyle w:val="ListBullet"/>
+      </w:pPr>
+      <w:r>
+        <w:t>Retrieval rank thấp (MAP=0.32) do câu out_of_domain không có context liên quan — đây là kết quả mong đợi.</w:t>
+      </w:r>
+    </w:p>
+    <w:p/>
+    <w:p>
+      <w:pPr>
+        <w:pStyle w:val="Heading1"/>
+        <w:jc w:val="left"/>
+      </w:pPr>
+      <w:r>
+        <w:t>6. NHẬN XÉT VÀ ĐỀ XUẤT</w:t>
       </w:r>
     </w:p>
     <w:p>

</xml_diff>